<commit_message>
All code for first paper submission
</commit_message>
<xml_diff>
--- a/Code/Modelling-results.docx
+++ b/Code/Modelling-results.docx
@@ -35,7 +35,7 @@
         <w:pStyle w:val="Date"/>
       </w:pPr>
       <w:r>
-        <w:t xml:space="preserve">2023-08-08</w:t>
+        <w:t xml:space="preserve">2024-01-06</w:t>
       </w:r>
     </w:p>
     <w:bookmarkStart w:id="20" w:name="Xb702e1b8e0e8adcfb58b97f3d9ec9cdca964984"/>
@@ -64,15 +64,15 @@
         <w:tblCaption w:val="Parameter estimates, standard errors, and model maximum gradients from each modelling scenario."/>
       </w:tblPr>
       <w:tblGrid>
-        <w:gridCol w:w="803"/>
-        <w:gridCol w:w="573"/>
-        <w:gridCol w:w="765"/>
-        <w:gridCol w:w="650"/>
-        <w:gridCol w:w="841"/>
-        <w:gridCol w:w="612"/>
-        <w:gridCol w:w="1645"/>
-        <w:gridCol w:w="1377"/>
-        <w:gridCol w:w="650"/>
+        <w:gridCol w:w="811"/>
+        <w:gridCol w:w="579"/>
+        <w:gridCol w:w="772"/>
+        <w:gridCol w:w="618"/>
+        <w:gridCol w:w="811"/>
+        <w:gridCol w:w="618"/>
+        <w:gridCol w:w="1661"/>
+        <w:gridCol w:w="1390"/>
+        <w:gridCol w:w="656"/>
       </w:tblGrid>
       <w:tr>
         <w:trPr>
@@ -220,55 +220,55 @@
               <w:jc w:val="left"/>
             </w:pPr>
             <w:r>
-              <w:t xml:space="preserve">-1.083e-16 (0.1203)</w:t>
-            </w:r>
-          </w:p>
-        </w:tc>
-        <w:tc>
-          <w:tcPr/>
-          <w:p>
-            <w:pPr>
-              <w:pStyle w:val="Compact"/>
-              <w:jc w:val="left"/>
-            </w:pPr>
-            <w:r>
-              <w:t xml:space="preserve">-0.2601 (0.2694)</w:t>
-            </w:r>
-          </w:p>
-        </w:tc>
-        <w:tc>
-          <w:tcPr/>
-          <w:p>
-            <w:pPr>
-              <w:pStyle w:val="Compact"/>
-              <w:jc w:val="left"/>
-            </w:pPr>
-            <w:r>
-              <w:t xml:space="preserve">-0.1845 (0.1369)</w:t>
-            </w:r>
-          </w:p>
-        </w:tc>
-        <w:tc>
-          <w:tcPr/>
-          <w:p>
-            <w:pPr>
-              <w:pStyle w:val="Compact"/>
-              <w:jc w:val="left"/>
-            </w:pPr>
-            <w:r>
-              <w:t xml:space="preserve">-5.635 (1.56)</w:t>
-            </w:r>
-          </w:p>
-        </w:tc>
-        <w:tc>
-          <w:tcPr/>
-          <w:p>
-            <w:pPr>
-              <w:pStyle w:val="Compact"/>
-              <w:jc w:val="left"/>
-            </w:pPr>
-            <w:r>
-              <w:t xml:space="preserve">1.911 (0.4683)</w:t>
+              <w:t xml:space="preserve">-2.641e-17 (0.4028)</w:t>
+            </w:r>
+          </w:p>
+        </w:tc>
+        <w:tc>
+          <w:tcPr/>
+          <w:p>
+            <w:pPr>
+              <w:pStyle w:val="Compact"/>
+              <w:jc w:val="left"/>
+            </w:pPr>
+            <w:r>
+              <w:t xml:space="preserve">1.463 (0.2599)</w:t>
+            </w:r>
+          </w:p>
+        </w:tc>
+        <w:tc>
+          <w:tcPr/>
+          <w:p>
+            <w:pPr>
+              <w:pStyle w:val="Compact"/>
+              <w:jc w:val="left"/>
+            </w:pPr>
+            <w:r>
+              <w:t xml:space="preserve">0.855 (0.3554)</w:t>
+            </w:r>
+          </w:p>
+        </w:tc>
+        <w:tc>
+          <w:tcPr/>
+          <w:p>
+            <w:pPr>
+              <w:pStyle w:val="Compact"/>
+              <w:jc w:val="left"/>
+            </w:pPr>
+            <w:r>
+              <w:t xml:space="preserve">-4.049 (0.5361)</w:t>
+            </w:r>
+          </w:p>
+        </w:tc>
+        <w:tc>
+          <w:tcPr/>
+          <w:p>
+            <w:pPr>
+              <w:pStyle w:val="Compact"/>
+              <w:jc w:val="left"/>
+            </w:pPr>
+            <w:r>
+              <w:t xml:space="preserve">1.005 (0.4214)</w:t>
             </w:r>
           </w:p>
         </w:tc>
@@ -292,7 +292,7 @@
               <w:jc w:val="right"/>
             </w:pPr>
             <w:r>
-              <w:t xml:space="preserve">1.0e-06</w:t>
+              <w:t xml:space="preserve">7.0e-07</w:t>
             </w:r>
           </w:p>
         </w:tc>
@@ -330,79 +330,79 @@
               <w:jc w:val="left"/>
             </w:pPr>
             <w:r>
-              <w:t xml:space="preserve">2.718e-18 (0.1527)</w:t>
-            </w:r>
-          </w:p>
-        </w:tc>
-        <w:tc>
-          <w:tcPr/>
-          <w:p>
-            <w:pPr>
-              <w:pStyle w:val="Compact"/>
-              <w:jc w:val="left"/>
-            </w:pPr>
-            <w:r>
-              <w:t xml:space="preserve">0.9302 (0.1758)</w:t>
-            </w:r>
-          </w:p>
-        </w:tc>
-        <w:tc>
-          <w:tcPr/>
-          <w:p>
-            <w:pPr>
-              <w:pStyle w:val="Compact"/>
-              <w:jc w:val="left"/>
-            </w:pPr>
-            <w:r>
-              <w:t xml:space="preserve">-8.858e-16 (0.01617)</w:t>
-            </w:r>
-          </w:p>
-        </w:tc>
-        <w:tc>
-          <w:tcPr/>
-          <w:p>
-            <w:pPr>
-              <w:pStyle w:val="Compact"/>
-              <w:jc w:val="left"/>
-            </w:pPr>
-            <w:r>
-              <w:t xml:space="preserve">-4.899 (0.3592)</w:t>
-            </w:r>
-          </w:p>
-        </w:tc>
-        <w:tc>
-          <w:tcPr/>
-          <w:p>
-            <w:pPr>
-              <w:pStyle w:val="Compact"/>
-              <w:jc w:val="left"/>
-            </w:pPr>
-            <w:r>
-              <w:t xml:space="preserve">1.629 (0.4129)</w:t>
-            </w:r>
-          </w:p>
-        </w:tc>
-        <w:tc>
-          <w:tcPr/>
-          <w:p>
-            <w:pPr>
-              <w:pStyle w:val="Compact"/>
-              <w:jc w:val="left"/>
-            </w:pPr>
-            <w:r>
-              <w:t xml:space="preserve">0.9746 (0.1437)</w:t>
-            </w:r>
-          </w:p>
-        </w:tc>
-        <w:tc>
-          <w:tcPr/>
-          <w:p>
-            <w:pPr>
-              <w:pStyle w:val="Compact"/>
-              <w:jc w:val="right"/>
-            </w:pPr>
-            <w:r>
-              <w:t xml:space="preserve">7.0e-07</w:t>
+              <w:t xml:space="preserve">7.18e-17 (1.536)</w:t>
+            </w:r>
+          </w:p>
+        </w:tc>
+        <w:tc>
+          <w:tcPr/>
+          <w:p>
+            <w:pPr>
+              <w:pStyle w:val="Compact"/>
+              <w:jc w:val="left"/>
+            </w:pPr>
+            <w:r>
+              <w:t xml:space="preserve">2.057 (0.2687)</w:t>
+            </w:r>
+          </w:p>
+        </w:tc>
+        <w:tc>
+          <w:tcPr/>
+          <w:p>
+            <w:pPr>
+              <w:pStyle w:val="Compact"/>
+              <w:jc w:val="left"/>
+            </w:pPr>
+            <w:r>
+              <w:t xml:space="preserve">0.3577 (0.1515)</w:t>
+            </w:r>
+          </w:p>
+        </w:tc>
+        <w:tc>
+          <w:tcPr/>
+          <w:p>
+            <w:pPr>
+              <w:pStyle w:val="Compact"/>
+              <w:jc w:val="left"/>
+            </w:pPr>
+            <w:r>
+              <w:t xml:space="preserve">-4.252 (0.2444)</w:t>
+            </w:r>
+          </w:p>
+        </w:tc>
+        <w:tc>
+          <w:tcPr/>
+          <w:p>
+            <w:pPr>
+              <w:pStyle w:val="Compact"/>
+              <w:jc w:val="left"/>
+            </w:pPr>
+            <w:r>
+              <w:t xml:space="preserve">0.952 (0.3758)</w:t>
+            </w:r>
+          </w:p>
+        </w:tc>
+        <w:tc>
+          <w:tcPr/>
+          <w:p>
+            <w:pPr>
+              <w:pStyle w:val="Compact"/>
+              <w:jc w:val="left"/>
+            </w:pPr>
+            <w:r>
+              <w:t xml:space="preserve">1.171 (0.145)</w:t>
+            </w:r>
+          </w:p>
+        </w:tc>
+        <w:tc>
+          <w:tcPr/>
+          <w:p>
+            <w:pPr>
+              <w:pStyle w:val="Compact"/>
+              <w:jc w:val="right"/>
+            </w:pPr>
+            <w:r>
+              <w:t xml:space="preserve">2.0e-06</w:t>
             </w:r>
           </w:p>
         </w:tc>
@@ -440,79 +440,79 @@
               <w:jc w:val="left"/>
             </w:pPr>
             <w:r>
-              <w:t xml:space="preserve">2.826e-21 (0.1742)</w:t>
-            </w:r>
-          </w:p>
-        </w:tc>
-        <w:tc>
-          <w:tcPr/>
-          <w:p>
-            <w:pPr>
-              <w:pStyle w:val="Compact"/>
-              <w:jc w:val="left"/>
-            </w:pPr>
-            <w:r>
-              <w:t xml:space="preserve">-1.564 (0.2096)</w:t>
-            </w:r>
-          </w:p>
-        </w:tc>
-        <w:tc>
-          <w:tcPr/>
-          <w:p>
-            <w:pPr>
-              <w:pStyle w:val="Compact"/>
-              <w:jc w:val="left"/>
-            </w:pPr>
-            <w:r>
-              <w:t xml:space="preserve">-4.827e-18 (0.008156)</w:t>
-            </w:r>
-          </w:p>
-        </w:tc>
-        <w:tc>
-          <w:tcPr/>
-          <w:p>
-            <w:pPr>
-              <w:pStyle w:val="Compact"/>
-              <w:jc w:val="left"/>
-            </w:pPr>
-            <w:r>
-              <w:t xml:space="preserve">-4.177 (0.2644)</w:t>
-            </w:r>
-          </w:p>
-        </w:tc>
-        <w:tc>
-          <w:tcPr/>
-          <w:p>
-            <w:pPr>
-              <w:pStyle w:val="Compact"/>
-              <w:jc w:val="left"/>
-            </w:pPr>
-            <w:r>
-              <w:t xml:space="preserve">1.543 (0.4253)</w:t>
-            </w:r>
-          </w:p>
-        </w:tc>
-        <w:tc>
-          <w:tcPr/>
-          <w:p>
-            <w:pPr>
-              <w:pStyle w:val="Compact"/>
-              <w:jc w:val="left"/>
-            </w:pPr>
-            <w:r>
-              <w:t xml:space="preserve">1.271 (0.1302)</w:t>
-            </w:r>
-          </w:p>
-        </w:tc>
-        <w:tc>
-          <w:tcPr/>
-          <w:p>
-            <w:pPr>
-              <w:pStyle w:val="Compact"/>
-              <w:jc w:val="right"/>
-            </w:pPr>
-            <w:r>
-              <w:t xml:space="preserve">2.0e-07</w:t>
+              <w:t xml:space="preserve">NA</w:t>
+            </w:r>
+          </w:p>
+        </w:tc>
+        <w:tc>
+          <w:tcPr/>
+          <w:p>
+            <w:pPr>
+              <w:pStyle w:val="Compact"/>
+              <w:jc w:val="left"/>
+            </w:pPr>
+            <w:r>
+              <w:t xml:space="preserve">NA</w:t>
+            </w:r>
+          </w:p>
+        </w:tc>
+        <w:tc>
+          <w:tcPr/>
+          <w:p>
+            <w:pPr>
+              <w:pStyle w:val="Compact"/>
+              <w:jc w:val="left"/>
+            </w:pPr>
+            <w:r>
+              <w:t xml:space="preserve">NA</w:t>
+            </w:r>
+          </w:p>
+        </w:tc>
+        <w:tc>
+          <w:tcPr/>
+          <w:p>
+            <w:pPr>
+              <w:pStyle w:val="Compact"/>
+              <w:jc w:val="left"/>
+            </w:pPr>
+            <w:r>
+              <w:t xml:space="preserve">NA</w:t>
+            </w:r>
+          </w:p>
+        </w:tc>
+        <w:tc>
+          <w:tcPr/>
+          <w:p>
+            <w:pPr>
+              <w:pStyle w:val="Compact"/>
+              <w:jc w:val="left"/>
+            </w:pPr>
+            <w:r>
+              <w:t xml:space="preserve">NA</w:t>
+            </w:r>
+          </w:p>
+        </w:tc>
+        <w:tc>
+          <w:tcPr/>
+          <w:p>
+            <w:pPr>
+              <w:pStyle w:val="Compact"/>
+              <w:jc w:val="left"/>
+            </w:pPr>
+            <w:r>
+              <w:t xml:space="preserve">NA</w:t>
+            </w:r>
+          </w:p>
+        </w:tc>
+        <w:tc>
+          <w:tcPr/>
+          <w:p>
+            <w:pPr>
+              <w:pStyle w:val="Compact"/>
+              <w:jc w:val="right"/>
+            </w:pPr>
+            <w:r>
+              <w:t xml:space="preserve">NA</w:t>
             </w:r>
           </w:p>
         </w:tc>
@@ -550,79 +550,79 @@
               <w:jc w:val="left"/>
             </w:pPr>
             <w:r>
-              <w:t xml:space="preserve">-1.54 (3.36)</w:t>
-            </w:r>
-          </w:p>
-        </w:tc>
-        <w:tc>
-          <w:tcPr/>
-          <w:p>
-            <w:pPr>
-              <w:pStyle w:val="Compact"/>
-              <w:jc w:val="left"/>
-            </w:pPr>
-            <w:r>
-              <w:t xml:space="preserve">-16.14 (1.622)</w:t>
-            </w:r>
-          </w:p>
-        </w:tc>
-        <w:tc>
-          <w:tcPr/>
-          <w:p>
-            <w:pPr>
-              <w:pStyle w:val="Compact"/>
-              <w:jc w:val="left"/>
-            </w:pPr>
-            <w:r>
-              <w:t xml:space="preserve">5.51e-18 (0.01691)</w:t>
-            </w:r>
-          </w:p>
-        </w:tc>
-        <w:tc>
-          <w:tcPr/>
-          <w:p>
-            <w:pPr>
-              <w:pStyle w:val="Compact"/>
-              <w:jc w:val="left"/>
-            </w:pPr>
-            <w:r>
-              <w:t xml:space="preserve">6.396 (3884)</w:t>
-            </w:r>
-          </w:p>
-        </w:tc>
-        <w:tc>
-          <w:tcPr/>
-          <w:p>
-            <w:pPr>
-              <w:pStyle w:val="Compact"/>
-              <w:jc w:val="left"/>
-            </w:pPr>
-            <w:r>
-              <w:t xml:space="preserve">3.134 (0.2707)</w:t>
-            </w:r>
-          </w:p>
-        </w:tc>
-        <w:tc>
-          <w:tcPr/>
-          <w:p>
-            <w:pPr>
-              <w:pStyle w:val="Compact"/>
-              <w:jc w:val="left"/>
-            </w:pPr>
-            <w:r>
-              <w:t xml:space="preserve">3.277 (0.1121)</w:t>
-            </w:r>
-          </w:p>
-        </w:tc>
-        <w:tc>
-          <w:tcPr/>
-          <w:p>
-            <w:pPr>
-              <w:pStyle w:val="Compact"/>
-              <w:jc w:val="right"/>
-            </w:pPr>
-            <w:r>
-              <w:t xml:space="preserve">2.0e-07</w:t>
+              <w:t xml:space="preserve">NA</w:t>
+            </w:r>
+          </w:p>
+        </w:tc>
+        <w:tc>
+          <w:tcPr/>
+          <w:p>
+            <w:pPr>
+              <w:pStyle w:val="Compact"/>
+              <w:jc w:val="left"/>
+            </w:pPr>
+            <w:r>
+              <w:t xml:space="preserve">NA</w:t>
+            </w:r>
+          </w:p>
+        </w:tc>
+        <w:tc>
+          <w:tcPr/>
+          <w:p>
+            <w:pPr>
+              <w:pStyle w:val="Compact"/>
+              <w:jc w:val="left"/>
+            </w:pPr>
+            <w:r>
+              <w:t xml:space="preserve">NA</w:t>
+            </w:r>
+          </w:p>
+        </w:tc>
+        <w:tc>
+          <w:tcPr/>
+          <w:p>
+            <w:pPr>
+              <w:pStyle w:val="Compact"/>
+              <w:jc w:val="left"/>
+            </w:pPr>
+            <w:r>
+              <w:t xml:space="preserve">NA</w:t>
+            </w:r>
+          </w:p>
+        </w:tc>
+        <w:tc>
+          <w:tcPr/>
+          <w:p>
+            <w:pPr>
+              <w:pStyle w:val="Compact"/>
+              <w:jc w:val="left"/>
+            </w:pPr>
+            <w:r>
+              <w:t xml:space="preserve">NA</w:t>
+            </w:r>
+          </w:p>
+        </w:tc>
+        <w:tc>
+          <w:tcPr/>
+          <w:p>
+            <w:pPr>
+              <w:pStyle w:val="Compact"/>
+              <w:jc w:val="left"/>
+            </w:pPr>
+            <w:r>
+              <w:t xml:space="preserve">NA</w:t>
+            </w:r>
+          </w:p>
+        </w:tc>
+        <w:tc>
+          <w:tcPr/>
+          <w:p>
+            <w:pPr>
+              <w:pStyle w:val="Compact"/>
+              <w:jc w:val="right"/>
+            </w:pPr>
+            <w:r>
+              <w:t xml:space="preserve">NA</w:t>
             </w:r>
           </w:p>
         </w:tc>
@@ -660,79 +660,79 @@
               <w:jc w:val="left"/>
             </w:pPr>
             <w:r>
-              <w:t xml:space="preserve">NA</w:t>
-            </w:r>
-          </w:p>
-        </w:tc>
-        <w:tc>
-          <w:tcPr/>
-          <w:p>
-            <w:pPr>
-              <w:pStyle w:val="Compact"/>
-              <w:jc w:val="left"/>
-            </w:pPr>
-            <w:r>
-              <w:t xml:space="preserve">NA</w:t>
-            </w:r>
-          </w:p>
-        </w:tc>
-        <w:tc>
-          <w:tcPr/>
-          <w:p>
-            <w:pPr>
-              <w:pStyle w:val="Compact"/>
-              <w:jc w:val="left"/>
-            </w:pPr>
-            <w:r>
-              <w:t xml:space="preserve">NA</w:t>
-            </w:r>
-          </w:p>
-        </w:tc>
-        <w:tc>
-          <w:tcPr/>
-          <w:p>
-            <w:pPr>
-              <w:pStyle w:val="Compact"/>
-              <w:jc w:val="left"/>
-            </w:pPr>
-            <w:r>
-              <w:t xml:space="preserve">NA</w:t>
-            </w:r>
-          </w:p>
-        </w:tc>
-        <w:tc>
-          <w:tcPr/>
-          <w:p>
-            <w:pPr>
-              <w:pStyle w:val="Compact"/>
-              <w:jc w:val="left"/>
-            </w:pPr>
-            <w:r>
-              <w:t xml:space="preserve">NA</w:t>
-            </w:r>
-          </w:p>
-        </w:tc>
-        <w:tc>
-          <w:tcPr/>
-          <w:p>
-            <w:pPr>
-              <w:pStyle w:val="Compact"/>
-              <w:jc w:val="left"/>
-            </w:pPr>
-            <w:r>
-              <w:t xml:space="preserve">NA</w:t>
-            </w:r>
-          </w:p>
-        </w:tc>
-        <w:tc>
-          <w:tcPr/>
-          <w:p>
-            <w:pPr>
-              <w:pStyle w:val="Compact"/>
-              <w:jc w:val="right"/>
-            </w:pPr>
-            <w:r>
-              <w:t xml:space="preserve">NA</w:t>
+              <w:t xml:space="preserve">3.151e-21 (2.68)</w:t>
+            </w:r>
+          </w:p>
+        </w:tc>
+        <w:tc>
+          <w:tcPr/>
+          <w:p>
+            <w:pPr>
+              <w:pStyle w:val="Compact"/>
+              <w:jc w:val="left"/>
+            </w:pPr>
+            <w:r>
+              <w:t xml:space="preserve">39.25 (3.689)</w:t>
+            </w:r>
+          </w:p>
+        </w:tc>
+        <w:tc>
+          <w:tcPr/>
+          <w:p>
+            <w:pPr>
+              <w:pStyle w:val="Compact"/>
+              <w:jc w:val="left"/>
+            </w:pPr>
+            <w:r>
+              <w:t xml:space="preserve">1.256e-15 (0.07904)</w:t>
+            </w:r>
+          </w:p>
+        </w:tc>
+        <w:tc>
+          <w:tcPr/>
+          <w:p>
+            <w:pPr>
+              <w:pStyle w:val="Compact"/>
+              <w:jc w:val="left"/>
+            </w:pPr>
+            <w:r>
+              <w:t xml:space="preserve">6.4 (3199)</w:t>
+            </w:r>
+          </w:p>
+        </w:tc>
+        <w:tc>
+          <w:tcPr/>
+          <w:p>
+            <w:pPr>
+              <w:pStyle w:val="Compact"/>
+              <w:jc w:val="left"/>
+            </w:pPr>
+            <w:r>
+              <w:t xml:space="preserve">3.882 (0.3003)</w:t>
+            </w:r>
+          </w:p>
+        </w:tc>
+        <w:tc>
+          <w:tcPr/>
+          <w:p>
+            <w:pPr>
+              <w:pStyle w:val="Compact"/>
+              <w:jc w:val="left"/>
+            </w:pPr>
+            <w:r>
+              <w:t xml:space="preserve">3.008 (0.08917)</w:t>
+            </w:r>
+          </w:p>
+        </w:tc>
+        <w:tc>
+          <w:tcPr/>
+          <w:p>
+            <w:pPr>
+              <w:pStyle w:val="Compact"/>
+              <w:jc w:val="right"/>
+            </w:pPr>
+            <w:r>
+              <w:t xml:space="preserve">7.5e-06</w:t>
             </w:r>
           </w:p>
         </w:tc>
@@ -770,79 +770,79 @@
               <w:jc w:val="left"/>
             </w:pPr>
             <w:r>
-              <w:t xml:space="preserve">1.637e-13 (0.1405)</w:t>
-            </w:r>
-          </w:p>
-        </w:tc>
-        <w:tc>
-          <w:tcPr/>
-          <w:p>
-            <w:pPr>
-              <w:pStyle w:val="Compact"/>
-              <w:jc w:val="left"/>
-            </w:pPr>
-            <w:r>
-              <w:t xml:space="preserve">-0.8007 (0.1772)</w:t>
-            </w:r>
-          </w:p>
-        </w:tc>
-        <w:tc>
-          <w:tcPr/>
-          <w:p>
-            <w:pPr>
-              <w:pStyle w:val="Compact"/>
-              <w:jc w:val="left"/>
-            </w:pPr>
-            <w:r>
-              <w:t xml:space="preserve">5.493e-10 (0.01661)</w:t>
-            </w:r>
-          </w:p>
-        </w:tc>
-        <w:tc>
-          <w:tcPr/>
-          <w:p>
-            <w:pPr>
-              <w:pStyle w:val="Compact"/>
-              <w:jc w:val="left"/>
-            </w:pPr>
-            <w:r>
-              <w:t xml:space="preserve">-4.215 (0.2967)</w:t>
-            </w:r>
-          </w:p>
-        </w:tc>
-        <w:tc>
-          <w:tcPr/>
-          <w:p>
-            <w:pPr>
-              <w:pStyle w:val="Compact"/>
-              <w:jc w:val="left"/>
-            </w:pPr>
-            <w:r>
-              <w:t xml:space="preserve">1.659 (0.4436)</w:t>
-            </w:r>
-          </w:p>
-        </w:tc>
-        <w:tc>
-          <w:tcPr/>
-          <w:p>
-            <w:pPr>
-              <w:pStyle w:val="Compact"/>
-              <w:jc w:val="left"/>
-            </w:pPr>
-            <w:r>
-              <w:t xml:space="preserve">1.201 (0.1452)</w:t>
-            </w:r>
-          </w:p>
-        </w:tc>
-        <w:tc>
-          <w:tcPr/>
-          <w:p>
-            <w:pPr>
-              <w:pStyle w:val="Compact"/>
-              <w:jc w:val="right"/>
-            </w:pPr>
-            <w:r>
-              <w:t xml:space="preserve">2.0e-06</w:t>
+              <w:t xml:space="preserve">-1.172 (0.3827)</w:t>
+            </w:r>
+          </w:p>
+        </w:tc>
+        <w:tc>
+          <w:tcPr/>
+          <w:p>
+            <w:pPr>
+              <w:pStyle w:val="Compact"/>
+              <w:jc w:val="left"/>
+            </w:pPr>
+            <w:r>
+              <w:t xml:space="preserve">1.994 (0.3609)</w:t>
+            </w:r>
+          </w:p>
+        </w:tc>
+        <w:tc>
+          <w:tcPr/>
+          <w:p>
+            <w:pPr>
+              <w:pStyle w:val="Compact"/>
+              <w:jc w:val="left"/>
+            </w:pPr>
+            <w:r>
+              <w:t xml:space="preserve">0.3748 (0.1743)</w:t>
+            </w:r>
+          </w:p>
+        </w:tc>
+        <w:tc>
+          <w:tcPr/>
+          <w:p>
+            <w:pPr>
+              <w:pStyle w:val="Compact"/>
+              <w:jc w:val="left"/>
+            </w:pPr>
+            <w:r>
+              <w:t xml:space="preserve">-3.75 (0.267)</w:t>
+            </w:r>
+          </w:p>
+        </w:tc>
+        <w:tc>
+          <w:tcPr/>
+          <w:p>
+            <w:pPr>
+              <w:pStyle w:val="Compact"/>
+              <w:jc w:val="left"/>
+            </w:pPr>
+            <w:r>
+              <w:t xml:space="preserve">1.133 (0.3714)</w:t>
+            </w:r>
+          </w:p>
+        </w:tc>
+        <w:tc>
+          <w:tcPr/>
+          <w:p>
+            <w:pPr>
+              <w:pStyle w:val="Compact"/>
+              <w:jc w:val="left"/>
+            </w:pPr>
+            <w:r>
+              <w:t xml:space="preserve">1.073 (0.1951)</w:t>
+            </w:r>
+          </w:p>
+        </w:tc>
+        <w:tc>
+          <w:tcPr/>
+          <w:p>
+            <w:pPr>
+              <w:pStyle w:val="Compact"/>
+              <w:jc w:val="right"/>
+            </w:pPr>
+            <w:r>
+              <w:t xml:space="preserve">1.5e-06</w:t>
             </w:r>
           </w:p>
         </w:tc>
@@ -880,79 +880,79 @@
               <w:jc w:val="left"/>
             </w:pPr>
             <w:r>
-              <w:t xml:space="preserve">-4.547e-19 (0.1741)</w:t>
-            </w:r>
-          </w:p>
-        </w:tc>
-        <w:tc>
-          <w:tcPr/>
-          <w:p>
-            <w:pPr>
-              <w:pStyle w:val="Compact"/>
-              <w:jc w:val="left"/>
-            </w:pPr>
-            <w:r>
-              <w:t xml:space="preserve">-1.484 (0.2151)</w:t>
-            </w:r>
-          </w:p>
-        </w:tc>
-        <w:tc>
-          <w:tcPr/>
-          <w:p>
-            <w:pPr>
-              <w:pStyle w:val="Compact"/>
-              <w:jc w:val="left"/>
-            </w:pPr>
-            <w:r>
-              <w:t xml:space="preserve">2.304e-16 (0.007907)</w:t>
-            </w:r>
-          </w:p>
-        </w:tc>
-        <w:tc>
-          <w:tcPr/>
-          <w:p>
-            <w:pPr>
-              <w:pStyle w:val="Compact"/>
-              <w:jc w:val="left"/>
-            </w:pPr>
-            <w:r>
-              <w:t xml:space="preserve">-3.778 (0.2295)</w:t>
-            </w:r>
-          </w:p>
-        </w:tc>
-        <w:tc>
-          <w:tcPr/>
-          <w:p>
-            <w:pPr>
-              <w:pStyle w:val="Compact"/>
-              <w:jc w:val="left"/>
-            </w:pPr>
-            <w:r>
-              <w:t xml:space="preserve">1.708 (0.416)</w:t>
-            </w:r>
-          </w:p>
-        </w:tc>
-        <w:tc>
-          <w:tcPr/>
-          <w:p>
-            <w:pPr>
-              <w:pStyle w:val="Compact"/>
-              <w:jc w:val="left"/>
-            </w:pPr>
-            <w:r>
-              <w:t xml:space="preserve">1.275 (0.1169)</w:t>
-            </w:r>
-          </w:p>
-        </w:tc>
-        <w:tc>
-          <w:tcPr/>
-          <w:p>
-            <w:pPr>
-              <w:pStyle w:val="Compact"/>
-              <w:jc w:val="right"/>
-            </w:pPr>
-            <w:r>
-              <w:t xml:space="preserve">8.0e-07</w:t>
+              <w:t xml:space="preserve">-4.128e-23 (1.262)</w:t>
+            </w:r>
+          </w:p>
+        </w:tc>
+        <w:tc>
+          <w:tcPr/>
+          <w:p>
+            <w:pPr>
+              <w:pStyle w:val="Compact"/>
+              <w:jc w:val="left"/>
+            </w:pPr>
+            <w:r>
+              <w:t xml:space="preserve">13.61 (1.535)</w:t>
+            </w:r>
+          </w:p>
+        </w:tc>
+        <w:tc>
+          <w:tcPr/>
+          <w:p>
+            <w:pPr>
+              <w:pStyle w:val="Compact"/>
+              <w:jc w:val="left"/>
+            </w:pPr>
+            <w:r>
+              <w:t xml:space="preserve">-5.065e-16 (0.03224)</w:t>
+            </w:r>
+          </w:p>
+        </w:tc>
+        <w:tc>
+          <w:tcPr/>
+          <w:p>
+            <w:pPr>
+              <w:pStyle w:val="Compact"/>
+              <w:jc w:val="left"/>
+            </w:pPr>
+            <w:r>
+              <w:t xml:space="preserve">6.926 (373900)</w:t>
+            </w:r>
+          </w:p>
+        </w:tc>
+        <w:tc>
+          <w:tcPr/>
+          <w:p>
+            <w:pPr>
+              <w:pStyle w:val="Compact"/>
+              <w:jc w:val="left"/>
+            </w:pPr>
+            <w:r>
+              <w:t xml:space="preserve">2.696 (0.3172)</w:t>
+            </w:r>
+          </w:p>
+        </w:tc>
+        <w:tc>
+          <w:tcPr/>
+          <w:p>
+            <w:pPr>
+              <w:pStyle w:val="Compact"/>
+              <w:jc w:val="left"/>
+            </w:pPr>
+            <w:r>
+              <w:t xml:space="preserve">3.729 (0.1278)</w:t>
+            </w:r>
+          </w:p>
+        </w:tc>
+        <w:tc>
+          <w:tcPr/>
+          <w:p>
+            <w:pPr>
+              <w:pStyle w:val="Compact"/>
+              <w:jc w:val="right"/>
+            </w:pPr>
+            <w:r>
+              <w:t xml:space="preserve">7.6e-06</w:t>
             </w:r>
           </w:p>
         </w:tc>
@@ -1100,79 +1100,79 @@
               <w:jc w:val="left"/>
             </w:pPr>
             <w:r>
-              <w:t xml:space="preserve">NA</w:t>
-            </w:r>
-          </w:p>
-        </w:tc>
-        <w:tc>
-          <w:tcPr/>
-          <w:p>
-            <w:pPr>
-              <w:pStyle w:val="Compact"/>
-              <w:jc w:val="left"/>
-            </w:pPr>
-            <w:r>
-              <w:t xml:space="preserve">NA</w:t>
-            </w:r>
-          </w:p>
-        </w:tc>
-        <w:tc>
-          <w:tcPr/>
-          <w:p>
-            <w:pPr>
-              <w:pStyle w:val="Compact"/>
-              <w:jc w:val="left"/>
-            </w:pPr>
-            <w:r>
-              <w:t xml:space="preserve">NA</w:t>
-            </w:r>
-          </w:p>
-        </w:tc>
-        <w:tc>
-          <w:tcPr/>
-          <w:p>
-            <w:pPr>
-              <w:pStyle w:val="Compact"/>
-              <w:jc w:val="left"/>
-            </w:pPr>
-            <w:r>
-              <w:t xml:space="preserve">NA</w:t>
-            </w:r>
-          </w:p>
-        </w:tc>
-        <w:tc>
-          <w:tcPr/>
-          <w:p>
-            <w:pPr>
-              <w:pStyle w:val="Compact"/>
-              <w:jc w:val="left"/>
-            </w:pPr>
-            <w:r>
-              <w:t xml:space="preserve">NA</w:t>
-            </w:r>
-          </w:p>
-        </w:tc>
-        <w:tc>
-          <w:tcPr/>
-          <w:p>
-            <w:pPr>
-              <w:pStyle w:val="Compact"/>
-              <w:jc w:val="left"/>
-            </w:pPr>
-            <w:r>
-              <w:t xml:space="preserve">NA</w:t>
-            </w:r>
-          </w:p>
-        </w:tc>
-        <w:tc>
-          <w:tcPr/>
-          <w:p>
-            <w:pPr>
-              <w:pStyle w:val="Compact"/>
-              <w:jc w:val="right"/>
-            </w:pPr>
-            <w:r>
-              <w:t xml:space="preserve">NA</w:t>
+              <w:t xml:space="preserve">-2.99e-21 (2.287)</w:t>
+            </w:r>
+          </w:p>
+        </w:tc>
+        <w:tc>
+          <w:tcPr/>
+          <w:p>
+            <w:pPr>
+              <w:pStyle w:val="Compact"/>
+              <w:jc w:val="left"/>
+            </w:pPr>
+            <w:r>
+              <w:t xml:space="preserve">33.41 (3.202)</w:t>
+            </w:r>
+          </w:p>
+        </w:tc>
+        <w:tc>
+          <w:tcPr/>
+          <w:p>
+            <w:pPr>
+              <w:pStyle w:val="Compact"/>
+              <w:jc w:val="left"/>
+            </w:pPr>
+            <w:r>
+              <w:t xml:space="preserve">7.012e-16 (0.1359)</w:t>
+            </w:r>
+          </w:p>
+        </w:tc>
+        <w:tc>
+          <w:tcPr/>
+          <w:p>
+            <w:pPr>
+              <w:pStyle w:val="Compact"/>
+              <w:jc w:val="left"/>
+            </w:pPr>
+            <w:r>
+              <w:t xml:space="preserve">1.571 (0.3921)</w:t>
+            </w:r>
+          </w:p>
+        </w:tc>
+        <w:tc>
+          <w:tcPr/>
+          <w:p>
+            <w:pPr>
+              <w:pStyle w:val="Compact"/>
+              <w:jc w:val="left"/>
+            </w:pPr>
+            <w:r>
+              <w:t xml:space="preserve">3.534 (0.3347)</w:t>
+            </w:r>
+          </w:p>
+        </w:tc>
+        <w:tc>
+          <w:tcPr/>
+          <w:p>
+            <w:pPr>
+              <w:pStyle w:val="Compact"/>
+              <w:jc w:val="left"/>
+            </w:pPr>
+            <w:r>
+              <w:t xml:space="preserve">2.985 (0.09158)</w:t>
+            </w:r>
+          </w:p>
+        </w:tc>
+        <w:tc>
+          <w:tcPr/>
+          <w:p>
+            <w:pPr>
+              <w:pStyle w:val="Compact"/>
+              <w:jc w:val="right"/>
+            </w:pPr>
+            <w:r>
+              <w:t xml:space="preserve">2.0e-06</w:t>
             </w:r>
           </w:p>
         </w:tc>
@@ -1210,79 +1210,79 @@
               <w:jc w:val="left"/>
             </w:pPr>
             <w:r>
-              <w:t xml:space="preserve">-4.822e-20 (0.1357)</w:t>
-            </w:r>
-          </w:p>
-        </w:tc>
-        <w:tc>
-          <w:tcPr/>
-          <w:p>
-            <w:pPr>
-              <w:pStyle w:val="Compact"/>
-              <w:jc w:val="left"/>
-            </w:pPr>
-            <w:r>
-              <w:t xml:space="preserve">0.6763 (0.1731)</w:t>
-            </w:r>
-          </w:p>
-        </w:tc>
-        <w:tc>
-          <w:tcPr/>
-          <w:p>
-            <w:pPr>
-              <w:pStyle w:val="Compact"/>
-              <w:jc w:val="left"/>
-            </w:pPr>
-            <w:r>
-              <w:t xml:space="preserve">0.1328 (0.06926)</w:t>
-            </w:r>
-          </w:p>
-        </w:tc>
-        <w:tc>
-          <w:tcPr/>
-          <w:p>
-            <w:pPr>
-              <w:pStyle w:val="Compact"/>
-              <w:jc w:val="left"/>
-            </w:pPr>
-            <w:r>
-              <w:t xml:space="preserve">-4.435 (0.3384)</w:t>
-            </w:r>
-          </w:p>
-        </w:tc>
-        <w:tc>
-          <w:tcPr/>
-          <w:p>
-            <w:pPr>
-              <w:pStyle w:val="Compact"/>
-              <w:jc w:val="left"/>
-            </w:pPr>
-            <w:r>
-              <w:t xml:space="preserve">1.493 (0.5094)</w:t>
-            </w:r>
-          </w:p>
-        </w:tc>
-        <w:tc>
-          <w:tcPr/>
-          <w:p>
-            <w:pPr>
-              <w:pStyle w:val="Compact"/>
-              <w:jc w:val="left"/>
-            </w:pPr>
-            <w:r>
-              <w:t xml:space="preserve">0.8865 (0.1297)</w:t>
-            </w:r>
-          </w:p>
-        </w:tc>
-        <w:tc>
-          <w:tcPr/>
-          <w:p>
-            <w:pPr>
-              <w:pStyle w:val="Compact"/>
-              <w:jc w:val="right"/>
-            </w:pPr>
-            <w:r>
-              <w:t xml:space="preserve">1.4e-06</w:t>
+              <w:t xml:space="preserve">-1.307e-18 (0.4593)</w:t>
+            </w:r>
+          </w:p>
+        </w:tc>
+        <w:tc>
+          <w:tcPr/>
+          <w:p>
+            <w:pPr>
+              <w:pStyle w:val="Compact"/>
+              <w:jc w:val="left"/>
+            </w:pPr>
+            <w:r>
+              <w:t xml:space="preserve">1.845 (0.2518)</w:t>
+            </w:r>
+          </w:p>
+        </w:tc>
+        <w:tc>
+          <w:tcPr/>
+          <w:p>
+            <w:pPr>
+              <w:pStyle w:val="Compact"/>
+              <w:jc w:val="left"/>
+            </w:pPr>
+            <w:r>
+              <w:t xml:space="preserve">0.336 (0.1329)</w:t>
+            </w:r>
+          </w:p>
+        </w:tc>
+        <w:tc>
+          <w:tcPr/>
+          <w:p>
+            <w:pPr>
+              <w:pStyle w:val="Compact"/>
+              <w:jc w:val="left"/>
+            </w:pPr>
+            <w:r>
+              <w:t xml:space="preserve">-4.04 (0.254)</w:t>
+            </w:r>
+          </w:p>
+        </w:tc>
+        <w:tc>
+          <w:tcPr/>
+          <w:p>
+            <w:pPr>
+              <w:pStyle w:val="Compact"/>
+              <w:jc w:val="left"/>
+            </w:pPr>
+            <w:r>
+              <w:t xml:space="preserve">0.9202 (0.3745)</w:t>
+            </w:r>
+          </w:p>
+        </w:tc>
+        <w:tc>
+          <w:tcPr/>
+          <w:p>
+            <w:pPr>
+              <w:pStyle w:val="Compact"/>
+              <w:jc w:val="left"/>
+            </w:pPr>
+            <w:r>
+              <w:t xml:space="preserve">1.176 (0.154)</w:t>
+            </w:r>
+          </w:p>
+        </w:tc>
+        <w:tc>
+          <w:tcPr/>
+          <w:p>
+            <w:pPr>
+              <w:pStyle w:val="Compact"/>
+              <w:jc w:val="right"/>
+            </w:pPr>
+            <w:r>
+              <w:t xml:space="preserve">1.7e-06</w:t>
             </w:r>
           </w:p>
         </w:tc>
@@ -1320,79 +1320,79 @@
               <w:jc w:val="left"/>
             </w:pPr>
             <w:r>
-              <w:t xml:space="preserve">-2.617e-19 (0.1553)</w:t>
-            </w:r>
-          </w:p>
-        </w:tc>
-        <w:tc>
-          <w:tcPr/>
-          <w:p>
-            <w:pPr>
-              <w:pStyle w:val="Compact"/>
-              <w:jc w:val="left"/>
-            </w:pPr>
-            <w:r>
-              <w:t xml:space="preserve">-1.49 (0.2044)</w:t>
-            </w:r>
-          </w:p>
-        </w:tc>
-        <w:tc>
-          <w:tcPr/>
-          <w:p>
-            <w:pPr>
-              <w:pStyle w:val="Compact"/>
-              <w:jc w:val="left"/>
-            </w:pPr>
-            <w:r>
-              <w:t xml:space="preserve">1.767e-17 (0.008195)</w:t>
-            </w:r>
-          </w:p>
-        </w:tc>
-        <w:tc>
-          <w:tcPr/>
-          <w:p>
-            <w:pPr>
-              <w:pStyle w:val="Compact"/>
-              <w:jc w:val="left"/>
-            </w:pPr>
-            <w:r>
-              <w:t xml:space="preserve">-4.064 (0.2545)</w:t>
-            </w:r>
-          </w:p>
-        </w:tc>
-        <w:tc>
-          <w:tcPr/>
-          <w:p>
-            <w:pPr>
-              <w:pStyle w:val="Compact"/>
-              <w:jc w:val="left"/>
-            </w:pPr>
-            <w:r>
-              <w:t xml:space="preserve">1.485 (0.4377)</w:t>
-            </w:r>
-          </w:p>
-        </w:tc>
-        <w:tc>
-          <w:tcPr/>
-          <w:p>
-            <w:pPr>
-              <w:pStyle w:val="Compact"/>
-              <w:jc w:val="left"/>
-            </w:pPr>
-            <w:r>
-              <w:t xml:space="preserve">1.239 (0.1275)</w:t>
-            </w:r>
-          </w:p>
-        </w:tc>
-        <w:tc>
-          <w:tcPr/>
-          <w:p>
-            <w:pPr>
-              <w:pStyle w:val="Compact"/>
-              <w:jc w:val="right"/>
-            </w:pPr>
-            <w:r>
-              <w:t xml:space="preserve">1.8e-06</w:t>
+              <w:t xml:space="preserve">0.03988 (7.573)</w:t>
+            </w:r>
+          </w:p>
+        </w:tc>
+        <w:tc>
+          <w:tcPr/>
+          <w:p>
+            <w:pPr>
+              <w:pStyle w:val="Compact"/>
+              <w:jc w:val="left"/>
+            </w:pPr>
+            <w:r>
+              <w:t xml:space="preserve">-2.515 (0.3104)</w:t>
+            </w:r>
+          </w:p>
+        </w:tc>
+        <w:tc>
+          <w:tcPr/>
+          <w:p>
+            <w:pPr>
+              <w:pStyle w:val="Compact"/>
+              <w:jc w:val="left"/>
+            </w:pPr>
+            <w:r>
+              <w:t xml:space="preserve">0.404 (0.1628)</w:t>
+            </w:r>
+          </w:p>
+        </w:tc>
+        <w:tc>
+          <w:tcPr/>
+          <w:p>
+            <w:pPr>
+              <w:pStyle w:val="Compact"/>
+              <w:jc w:val="left"/>
+            </w:pPr>
+            <w:r>
+              <w:t xml:space="preserve">-3.732 (0.2178)</w:t>
+            </w:r>
+          </w:p>
+        </w:tc>
+        <w:tc>
+          <w:tcPr/>
+          <w:p>
+            <w:pPr>
+              <w:pStyle w:val="Compact"/>
+              <w:jc w:val="left"/>
+            </w:pPr>
+            <w:r>
+              <w:t xml:space="preserve">1.231 (0.3611)</w:t>
+            </w:r>
+          </w:p>
+        </w:tc>
+        <w:tc>
+          <w:tcPr/>
+          <w:p>
+            <w:pPr>
+              <w:pStyle w:val="Compact"/>
+              <w:jc w:val="left"/>
+            </w:pPr>
+            <w:r>
+              <w:t xml:space="preserve">1.21 (0.1308)</w:t>
+            </w:r>
+          </w:p>
+        </w:tc>
+        <w:tc>
+          <w:tcPr/>
+          <w:p>
+            <w:pPr>
+              <w:pStyle w:val="Compact"/>
+              <w:jc w:val="right"/>
+            </w:pPr>
+            <w:r>
+              <w:t xml:space="preserve">3.0e-07</w:t>
             </w:r>
           </w:p>
         </w:tc>
@@ -1430,79 +1430,79 @@
               <w:jc w:val="left"/>
             </w:pPr>
             <w:r>
-              <w:t xml:space="preserve">1.146e-17 (7.982)</w:t>
-            </w:r>
-          </w:p>
-        </w:tc>
-        <w:tc>
-          <w:tcPr/>
-          <w:p>
-            <w:pPr>
-              <w:pStyle w:val="Compact"/>
-              <w:jc w:val="left"/>
-            </w:pPr>
-            <w:r>
-              <w:t xml:space="preserve">-22.54 (3.491)</w:t>
-            </w:r>
-          </w:p>
-        </w:tc>
-        <w:tc>
-          <w:tcPr/>
-          <w:p>
-            <w:pPr>
-              <w:pStyle w:val="Compact"/>
-              <w:jc w:val="left"/>
-            </w:pPr>
-            <w:r>
-              <w:t xml:space="preserve">3.04e-17 (0.01733)</w:t>
-            </w:r>
-          </w:p>
-        </w:tc>
-        <w:tc>
-          <w:tcPr/>
-          <w:p>
-            <w:pPr>
-              <w:pStyle w:val="Compact"/>
-              <w:jc w:val="left"/>
-            </w:pPr>
-            <w:r>
-              <w:t xml:space="preserve">6.494 (351200)</w:t>
-            </w:r>
-          </w:p>
-        </w:tc>
-        <w:tc>
-          <w:tcPr/>
-          <w:p>
-            <w:pPr>
-              <w:pStyle w:val="Compact"/>
-              <w:jc w:val="left"/>
-            </w:pPr>
-            <w:r>
-              <w:t xml:space="preserve">3.234 (0.2699)</w:t>
-            </w:r>
-          </w:p>
-        </w:tc>
-        <w:tc>
-          <w:tcPr/>
-          <w:p>
-            <w:pPr>
-              <w:pStyle w:val="Compact"/>
-              <w:jc w:val="left"/>
-            </w:pPr>
-            <w:r>
-              <w:t xml:space="preserve">2.892 (0.1068)</w:t>
-            </w:r>
-          </w:p>
-        </w:tc>
-        <w:tc>
-          <w:tcPr/>
-          <w:p>
-            <w:pPr>
-              <w:pStyle w:val="Compact"/>
-              <w:jc w:val="right"/>
-            </w:pPr>
-            <w:r>
-              <w:t xml:space="preserve">2.8e-06</w:t>
+              <w:t xml:space="preserve">-0.5688 (0.5555)</w:t>
+            </w:r>
+          </w:p>
+        </w:tc>
+        <w:tc>
+          <w:tcPr/>
+          <w:p>
+            <w:pPr>
+              <w:pStyle w:val="Compact"/>
+              <w:jc w:val="left"/>
+            </w:pPr>
+            <w:r>
+              <w:t xml:space="preserve">-2.635 (0.618)</w:t>
+            </w:r>
+          </w:p>
+        </w:tc>
+        <w:tc>
+          <w:tcPr/>
+          <w:p>
+            <w:pPr>
+              <w:pStyle w:val="Compact"/>
+              <w:jc w:val="left"/>
+            </w:pPr>
+            <w:r>
+              <w:t xml:space="preserve">0.2825 (0.1419)</w:t>
+            </w:r>
+          </w:p>
+        </w:tc>
+        <w:tc>
+          <w:tcPr/>
+          <w:p>
+            <w:pPr>
+              <w:pStyle w:val="Compact"/>
+              <w:jc w:val="left"/>
+            </w:pPr>
+            <w:r>
+              <w:t xml:space="preserve">-3.351 (0.4746)</w:t>
+            </w:r>
+          </w:p>
+        </w:tc>
+        <w:tc>
+          <w:tcPr/>
+          <w:p>
+            <w:pPr>
+              <w:pStyle w:val="Compact"/>
+              <w:jc w:val="left"/>
+            </w:pPr>
+            <w:r>
+              <w:t xml:space="preserve">1.252 (0.4164)</w:t>
+            </w:r>
+          </w:p>
+        </w:tc>
+        <w:tc>
+          <w:tcPr/>
+          <w:p>
+            <w:pPr>
+              <w:pStyle w:val="Compact"/>
+              <w:jc w:val="left"/>
+            </w:pPr>
+            <w:r>
+              <w:t xml:space="preserve">1.222 (0.2112)</w:t>
+            </w:r>
+          </w:p>
+        </w:tc>
+        <w:tc>
+          <w:tcPr/>
+          <w:p>
+            <w:pPr>
+              <w:pStyle w:val="Compact"/>
+              <w:jc w:val="right"/>
+            </w:pPr>
+            <w:r>
+              <w:t xml:space="preserve">8.0e-07</w:t>
             </w:r>
           </w:p>
         </w:tc>
@@ -1650,79 +1650,79 @@
               <w:jc w:val="left"/>
             </w:pPr>
             <w:r>
-              <w:t xml:space="preserve">-1.024e-19 (0.1343)</w:t>
-            </w:r>
-          </w:p>
-        </w:tc>
-        <w:tc>
-          <w:tcPr/>
-          <w:p>
-            <w:pPr>
-              <w:pStyle w:val="Compact"/>
-              <w:jc w:val="left"/>
-            </w:pPr>
-            <w:r>
-              <w:t xml:space="preserve">-0.9137 (0.1787)</w:t>
-            </w:r>
-          </w:p>
-        </w:tc>
-        <w:tc>
-          <w:tcPr/>
-          <w:p>
-            <w:pPr>
-              <w:pStyle w:val="Compact"/>
-              <w:jc w:val="left"/>
-            </w:pPr>
-            <w:r>
-              <w:t xml:space="preserve">-1.362e-15 (0.01443)</w:t>
-            </w:r>
-          </w:p>
-        </w:tc>
-        <w:tc>
-          <w:tcPr/>
-          <w:p>
-            <w:pPr>
-              <w:pStyle w:val="Compact"/>
-              <w:jc w:val="left"/>
-            </w:pPr>
-            <w:r>
-              <w:t xml:space="preserve">-4.11 (0.2986)</w:t>
-            </w:r>
-          </w:p>
-        </w:tc>
-        <w:tc>
-          <w:tcPr/>
-          <w:p>
-            <w:pPr>
-              <w:pStyle w:val="Compact"/>
-              <w:jc w:val="left"/>
-            </w:pPr>
-            <w:r>
-              <w:t xml:space="preserve">1.646 (0.4461)</w:t>
-            </w:r>
-          </w:p>
-        </w:tc>
-        <w:tc>
-          <w:tcPr/>
-          <w:p>
-            <w:pPr>
-              <w:pStyle w:val="Compact"/>
-              <w:jc w:val="left"/>
-            </w:pPr>
-            <w:r>
-              <w:t xml:space="preserve">1.085 (0.1435)</w:t>
-            </w:r>
-          </w:p>
-        </w:tc>
-        <w:tc>
-          <w:tcPr/>
-          <w:p>
-            <w:pPr>
-              <w:pStyle w:val="Compact"/>
-              <w:jc w:val="right"/>
-            </w:pPr>
-            <w:r>
-              <w:t xml:space="preserve">9.0e-07</w:t>
+              <w:t xml:space="preserve">1.018 (0.4032)</w:t>
+            </w:r>
+          </w:p>
+        </w:tc>
+        <w:tc>
+          <w:tcPr/>
+          <w:p>
+            <w:pPr>
+              <w:pStyle w:val="Compact"/>
+              <w:jc w:val="left"/>
+            </w:pPr>
+            <w:r>
+              <w:t xml:space="preserve">-2.247 (0.3512)</w:t>
+            </w:r>
+          </w:p>
+        </w:tc>
+        <w:tc>
+          <w:tcPr/>
+          <w:p>
+            <w:pPr>
+              <w:pStyle w:val="Compact"/>
+              <w:jc w:val="left"/>
+            </w:pPr>
+            <w:r>
+              <w:t xml:space="preserve">0.3797 (0.1641)</w:t>
+            </w:r>
+          </w:p>
+        </w:tc>
+        <w:tc>
+          <w:tcPr/>
+          <w:p>
+            <w:pPr>
+              <w:pStyle w:val="Compact"/>
+              <w:jc w:val="left"/>
+            </w:pPr>
+            <w:r>
+              <w:t xml:space="preserve">-4.122 (0.2854)</w:t>
+            </w:r>
+          </w:p>
+        </w:tc>
+        <w:tc>
+          <w:tcPr/>
+          <w:p>
+            <w:pPr>
+              <w:pStyle w:val="Compact"/>
+              <w:jc w:val="left"/>
+            </w:pPr>
+            <w:r>
+              <w:t xml:space="preserve">1.147 (0.37)</w:t>
+            </w:r>
+          </w:p>
+        </w:tc>
+        <w:tc>
+          <w:tcPr/>
+          <w:p>
+            <w:pPr>
+              <w:pStyle w:val="Compact"/>
+              <w:jc w:val="left"/>
+            </w:pPr>
+            <w:r>
+              <w:t xml:space="preserve">0.8631 (0.1979)</w:t>
+            </w:r>
+          </w:p>
+        </w:tc>
+        <w:tc>
+          <w:tcPr/>
+          <w:p>
+            <w:pPr>
+              <w:pStyle w:val="Compact"/>
+              <w:jc w:val="right"/>
+            </w:pPr>
+            <w:r>
+              <w:t xml:space="preserve">1.9e-06</w:t>
             </w:r>
           </w:p>
         </w:tc>
@@ -1760,79 +1760,79 @@
               <w:jc w:val="left"/>
             </w:pPr>
             <w:r>
-              <w:t xml:space="preserve">3.634e-21 (0.155)</w:t>
-            </w:r>
-          </w:p>
-        </w:tc>
-        <w:tc>
-          <w:tcPr/>
-          <w:p>
-            <w:pPr>
-              <w:pStyle w:val="Compact"/>
-              <w:jc w:val="left"/>
-            </w:pPr>
-            <w:r>
-              <w:t xml:space="preserve">1.513 (0.2118)</w:t>
-            </w:r>
-          </w:p>
-        </w:tc>
-        <w:tc>
-          <w:tcPr/>
-          <w:p>
-            <w:pPr>
-              <w:pStyle w:val="Compact"/>
-              <w:jc w:val="left"/>
-            </w:pPr>
-            <w:r>
-              <w:t xml:space="preserve">7.37e-16 (0.008024)</w:t>
-            </w:r>
-          </w:p>
-        </w:tc>
-        <w:tc>
-          <w:tcPr/>
-          <w:p>
-            <w:pPr>
-              <w:pStyle w:val="Compact"/>
-              <w:jc w:val="left"/>
-            </w:pPr>
-            <w:r>
-              <w:t xml:space="preserve">-3.882 (0.2297)</w:t>
-            </w:r>
-          </w:p>
-        </w:tc>
-        <w:tc>
-          <w:tcPr/>
-          <w:p>
-            <w:pPr>
-              <w:pStyle w:val="Compact"/>
-              <w:jc w:val="left"/>
-            </w:pPr>
-            <w:r>
-              <w:t xml:space="preserve">1.67 (0.4244)</w:t>
-            </w:r>
-          </w:p>
-        </w:tc>
-        <w:tc>
-          <w:tcPr/>
-          <w:p>
-            <w:pPr>
-              <w:pStyle w:val="Compact"/>
-              <w:jc w:val="left"/>
-            </w:pPr>
-            <w:r>
-              <w:t xml:space="preserve">1.248 (0.1196)</w:t>
-            </w:r>
-          </w:p>
-        </w:tc>
-        <w:tc>
-          <w:tcPr/>
-          <w:p>
-            <w:pPr>
-              <w:pStyle w:val="Compact"/>
-              <w:jc w:val="right"/>
-            </w:pPr>
-            <w:r>
-              <w:t xml:space="preserve">1.0e-06</w:t>
+              <w:t xml:space="preserve">NA</w:t>
+            </w:r>
+          </w:p>
+        </w:tc>
+        <w:tc>
+          <w:tcPr/>
+          <w:p>
+            <w:pPr>
+              <w:pStyle w:val="Compact"/>
+              <w:jc w:val="left"/>
+            </w:pPr>
+            <w:r>
+              <w:t xml:space="preserve">NA</w:t>
+            </w:r>
+          </w:p>
+        </w:tc>
+        <w:tc>
+          <w:tcPr/>
+          <w:p>
+            <w:pPr>
+              <w:pStyle w:val="Compact"/>
+              <w:jc w:val="left"/>
+            </w:pPr>
+            <w:r>
+              <w:t xml:space="preserve">NA</w:t>
+            </w:r>
+          </w:p>
+        </w:tc>
+        <w:tc>
+          <w:tcPr/>
+          <w:p>
+            <w:pPr>
+              <w:pStyle w:val="Compact"/>
+              <w:jc w:val="left"/>
+            </w:pPr>
+            <w:r>
+              <w:t xml:space="preserve">NA</w:t>
+            </w:r>
+          </w:p>
+        </w:tc>
+        <w:tc>
+          <w:tcPr/>
+          <w:p>
+            <w:pPr>
+              <w:pStyle w:val="Compact"/>
+              <w:jc w:val="left"/>
+            </w:pPr>
+            <w:r>
+              <w:t xml:space="preserve">NA</w:t>
+            </w:r>
+          </w:p>
+        </w:tc>
+        <w:tc>
+          <w:tcPr/>
+          <w:p>
+            <w:pPr>
+              <w:pStyle w:val="Compact"/>
+              <w:jc w:val="left"/>
+            </w:pPr>
+            <w:r>
+              <w:t xml:space="preserve">NA</w:t>
+            </w:r>
+          </w:p>
+        </w:tc>
+        <w:tc>
+          <w:tcPr/>
+          <w:p>
+            <w:pPr>
+              <w:pStyle w:val="Compact"/>
+              <w:jc w:val="right"/>
+            </w:pPr>
+            <w:r>
+              <w:t xml:space="preserve">NA</w:t>
             </w:r>
           </w:p>
         </w:tc>
@@ -1870,79 +1870,79 @@
               <w:jc w:val="left"/>
             </w:pPr>
             <w:r>
-              <w:t xml:space="preserve">2.068e-20 (0.1688)</w:t>
-            </w:r>
-          </w:p>
-        </w:tc>
-        <w:tc>
-          <w:tcPr/>
-          <w:p>
-            <w:pPr>
-              <w:pStyle w:val="Compact"/>
-              <w:jc w:val="left"/>
-            </w:pPr>
-            <w:r>
-              <w:t xml:space="preserve">-1.721 (0.269)</w:t>
-            </w:r>
-          </w:p>
-        </w:tc>
-        <w:tc>
-          <w:tcPr/>
-          <w:p>
-            <w:pPr>
-              <w:pStyle w:val="Compact"/>
-              <w:jc w:val="left"/>
-            </w:pPr>
-            <w:r>
-              <w:t xml:space="preserve">-3.597e-17 (0.007058)</w:t>
-            </w:r>
-          </w:p>
-        </w:tc>
-        <w:tc>
-          <w:tcPr/>
-          <w:p>
-            <w:pPr>
-              <w:pStyle w:val="Compact"/>
-              <w:jc w:val="left"/>
-            </w:pPr>
-            <w:r>
-              <w:t xml:space="preserve">-3.517 (0.2684)</w:t>
-            </w:r>
-          </w:p>
-        </w:tc>
-        <w:tc>
-          <w:tcPr/>
-          <w:p>
-            <w:pPr>
-              <w:pStyle w:val="Compact"/>
-              <w:jc w:val="left"/>
-            </w:pPr>
-            <w:r>
-              <w:t xml:space="preserve">1.798 (0.3864)</w:t>
-            </w:r>
-          </w:p>
-        </w:tc>
-        <w:tc>
-          <w:tcPr/>
-          <w:p>
-            <w:pPr>
-              <w:pStyle w:val="Compact"/>
-              <w:jc w:val="left"/>
-            </w:pPr>
-            <w:r>
-              <w:t xml:space="preserve">1.409 (0.1145)</w:t>
-            </w:r>
-          </w:p>
-        </w:tc>
-        <w:tc>
-          <w:tcPr/>
-          <w:p>
-            <w:pPr>
-              <w:pStyle w:val="Compact"/>
-              <w:jc w:val="right"/>
-            </w:pPr>
-            <w:r>
-              <w:t xml:space="preserve">5.3e-06</w:t>
+              <w:t xml:space="preserve">-6.886e-24 (2.192)</w:t>
+            </w:r>
+          </w:p>
+        </w:tc>
+        <w:tc>
+          <w:tcPr/>
+          <w:p>
+            <w:pPr>
+              <w:pStyle w:val="Compact"/>
+              <w:jc w:val="left"/>
+            </w:pPr>
+            <w:r>
+              <w:t xml:space="preserve">-32.45 (3.202)</w:t>
+            </w:r>
+          </w:p>
+        </w:tc>
+        <w:tc>
+          <w:tcPr/>
+          <w:p>
+            <w:pPr>
+              <w:pStyle w:val="Compact"/>
+              <w:jc w:val="left"/>
+            </w:pPr>
+            <w:r>
+              <w:t xml:space="preserve">-1.766e-18 (0.1115)</w:t>
+            </w:r>
+          </w:p>
+        </w:tc>
+        <w:tc>
+          <w:tcPr/>
+          <w:p>
+            <w:pPr>
+              <w:pStyle w:val="Compact"/>
+              <w:jc w:val="left"/>
+            </w:pPr>
+            <w:r>
+              <w:t xml:space="preserve">2.129 (0.5681)</w:t>
+            </w:r>
+          </w:p>
+        </w:tc>
+        <w:tc>
+          <w:tcPr/>
+          <w:p>
+            <w:pPr>
+              <w:pStyle w:val="Compact"/>
+              <w:jc w:val="left"/>
+            </w:pPr>
+            <w:r>
+              <w:t xml:space="preserve">3.498 (0.3339)</w:t>
+            </w:r>
+          </w:p>
+        </w:tc>
+        <w:tc>
+          <w:tcPr/>
+          <w:p>
+            <w:pPr>
+              <w:pStyle w:val="Compact"/>
+              <w:jc w:val="left"/>
+            </w:pPr>
+            <w:r>
+              <w:t xml:space="preserve">2.957 (0.09333)</w:t>
+            </w:r>
+          </w:p>
+        </w:tc>
+        <w:tc>
+          <w:tcPr/>
+          <w:p>
+            <w:pPr>
+              <w:pStyle w:val="Compact"/>
+              <w:jc w:val="right"/>
+            </w:pPr>
+            <w:r>
+              <w:t xml:space="preserve">1.5e-06</w:t>
             </w:r>
           </w:p>
         </w:tc>
@@ -1980,79 +1980,79 @@
               <w:jc w:val="left"/>
             </w:pPr>
             <w:r>
-              <w:t xml:space="preserve">-11.44 (1.897)</w:t>
-            </w:r>
-          </w:p>
-        </w:tc>
-        <w:tc>
-          <w:tcPr/>
-          <w:p>
-            <w:pPr>
-              <w:pStyle w:val="Compact"/>
-              <w:jc w:val="left"/>
-            </w:pPr>
-            <w:r>
-              <w:t xml:space="preserve">-43.04 (3.958)</w:t>
-            </w:r>
-          </w:p>
-        </w:tc>
-        <w:tc>
-          <w:tcPr/>
-          <w:p>
-            <w:pPr>
-              <w:pStyle w:val="Compact"/>
-              <w:jc w:val="left"/>
-            </w:pPr>
-            <w:r>
-              <w:t xml:space="preserve">-4.114e-17 (0.03781)</w:t>
-            </w:r>
-          </w:p>
-        </w:tc>
-        <w:tc>
-          <w:tcPr/>
-          <w:p>
-            <w:pPr>
-              <w:pStyle w:val="Compact"/>
-              <w:jc w:val="left"/>
-            </w:pPr>
-            <w:r>
-              <w:t xml:space="preserve">5.702 (196.4)</w:t>
-            </w:r>
-          </w:p>
-        </w:tc>
-        <w:tc>
-          <w:tcPr/>
-          <w:p>
-            <w:pPr>
-              <w:pStyle w:val="Compact"/>
-              <w:jc w:val="left"/>
-            </w:pPr>
-            <w:r>
-              <w:t xml:space="preserve">3.686 (0.2509)</w:t>
-            </w:r>
-          </w:p>
-        </w:tc>
-        <w:tc>
-          <w:tcPr/>
-          <w:p>
-            <w:pPr>
-              <w:pStyle w:val="Compact"/>
-              <w:jc w:val="left"/>
-            </w:pPr>
-            <w:r>
-              <w:t xml:space="preserve">1.884 (0.8476)</w:t>
-            </w:r>
-          </w:p>
-        </w:tc>
-        <w:tc>
-          <w:tcPr/>
-          <w:p>
-            <w:pPr>
-              <w:pStyle w:val="Compact"/>
-              <w:jc w:val="right"/>
-            </w:pPr>
-            <w:r>
-              <w:t xml:space="preserve">2.8e-06</w:t>
+              <w:t xml:space="preserve">1.877e-20 (3.445)</w:t>
+            </w:r>
+          </w:p>
+        </w:tc>
+        <w:tc>
+          <w:tcPr/>
+          <w:p>
+            <w:pPr>
+              <w:pStyle w:val="Compact"/>
+              <w:jc w:val="left"/>
+            </w:pPr>
+            <w:r>
+              <w:t xml:space="preserve">38.23 (3.553)</w:t>
+            </w:r>
+          </w:p>
+        </w:tc>
+        <w:tc>
+          <w:tcPr/>
+          <w:p>
+            <w:pPr>
+              <w:pStyle w:val="Compact"/>
+              <w:jc w:val="left"/>
+            </w:pPr>
+            <w:r>
+              <w:t xml:space="preserve">1.671e-16 (0.116)</w:t>
+            </w:r>
+          </w:p>
+        </w:tc>
+        <w:tc>
+          <w:tcPr/>
+          <w:p>
+            <w:pPr>
+              <w:pStyle w:val="Compact"/>
+              <w:jc w:val="left"/>
+            </w:pPr>
+            <w:r>
+              <w:t xml:space="preserve">6.534 (7039)</w:t>
+            </w:r>
+          </w:p>
+        </w:tc>
+        <w:tc>
+          <w:tcPr/>
+          <w:p>
+            <w:pPr>
+              <w:pStyle w:val="Compact"/>
+              <w:jc w:val="left"/>
+            </w:pPr>
+            <w:r>
+              <w:t xml:space="preserve">3.657 (0.3311)</w:t>
+            </w:r>
+          </w:p>
+        </w:tc>
+        <w:tc>
+          <w:tcPr/>
+          <w:p>
+            <w:pPr>
+              <w:pStyle w:val="Compact"/>
+              <w:jc w:val="left"/>
+            </w:pPr>
+            <w:r>
+              <w:t xml:space="preserve">2.941 (0.09323)</w:t>
+            </w:r>
+          </w:p>
+        </w:tc>
+        <w:tc>
+          <w:tcPr/>
+          <w:p>
+            <w:pPr>
+              <w:pStyle w:val="Compact"/>
+              <w:jc w:val="right"/>
+            </w:pPr>
+            <w:r>
+              <w:t xml:space="preserve">4.4e-06</w:t>
             </w:r>
           </w:p>
         </w:tc>
@@ -2245,91 +2245,91 @@
               <w:jc w:val="right"/>
             </w:pPr>
             <w:r>
-              <w:t xml:space="preserve">0.71</w:t>
-            </w:r>
-          </w:p>
-        </w:tc>
-        <w:tc>
-          <w:tcPr/>
-          <w:p>
-            <w:pPr>
-              <w:pStyle w:val="Compact"/>
-              <w:jc w:val="left"/>
-            </w:pPr>
-            <w:r>
-              <w:t xml:space="preserve">0.71 (0.58-0.85)</w:t>
-            </w:r>
-          </w:p>
-        </w:tc>
-        <w:tc>
-          <w:tcPr/>
-          <w:p>
-            <w:pPr>
-              <w:pStyle w:val="Compact"/>
-              <w:jc w:val="right"/>
-            </w:pPr>
-            <w:r>
-              <w:t xml:space="preserve">0.54</w:t>
-            </w:r>
-          </w:p>
-        </w:tc>
-        <w:tc>
-          <w:tcPr/>
-          <w:p>
-            <w:pPr>
-              <w:pStyle w:val="Compact"/>
-              <w:jc w:val="left"/>
-            </w:pPr>
-            <w:r>
-              <w:t xml:space="preserve">0.56 (0.38-0.71)</w:t>
-            </w:r>
-          </w:p>
-        </w:tc>
-        <w:tc>
-          <w:tcPr/>
-          <w:p>
-            <w:pPr>
-              <w:pStyle w:val="Compact"/>
-              <w:jc w:val="right"/>
-            </w:pPr>
-            <w:r>
-              <w:t xml:space="preserve">0.70</w:t>
-            </w:r>
-          </w:p>
-        </w:tc>
-        <w:tc>
-          <w:tcPr/>
-          <w:p>
-            <w:pPr>
-              <w:pStyle w:val="Compact"/>
-              <w:jc w:val="left"/>
-            </w:pPr>
-            <w:r>
-              <w:t xml:space="preserve">0.67 (0.6-0.84)</w:t>
-            </w:r>
-          </w:p>
-        </w:tc>
-        <w:tc>
-          <w:tcPr/>
-          <w:p>
-            <w:pPr>
-              <w:pStyle w:val="Compact"/>
-              <w:jc w:val="right"/>
-            </w:pPr>
-            <w:r>
-              <w:t xml:space="preserve">0.25</w:t>
-            </w:r>
-          </w:p>
-        </w:tc>
-        <w:tc>
-          <w:tcPr/>
-          <w:p>
-            <w:pPr>
-              <w:pStyle w:val="Compact"/>
-              <w:jc w:val="left"/>
-            </w:pPr>
-            <w:r>
-              <w:t xml:space="preserve">0.2 (0.11-0.46)</w:t>
+              <w:t xml:space="preserve">0.68</w:t>
+            </w:r>
+          </w:p>
+        </w:tc>
+        <w:tc>
+          <w:tcPr/>
+          <w:p>
+            <w:pPr>
+              <w:pStyle w:val="Compact"/>
+              <w:jc w:val="left"/>
+            </w:pPr>
+            <w:r>
+              <w:t xml:space="preserve">0.69 (0.57-0.78)</w:t>
+            </w:r>
+          </w:p>
+        </w:tc>
+        <w:tc>
+          <w:tcPr/>
+          <w:p>
+            <w:pPr>
+              <w:pStyle w:val="Compact"/>
+              <w:jc w:val="right"/>
+            </w:pPr>
+            <w:r>
+              <w:t xml:space="preserve">0.79</w:t>
+            </w:r>
+          </w:p>
+        </w:tc>
+        <w:tc>
+          <w:tcPr/>
+          <w:p>
+            <w:pPr>
+              <w:pStyle w:val="Compact"/>
+              <w:jc w:val="left"/>
+            </w:pPr>
+            <w:r>
+              <w:t xml:space="preserve">0.8 (0.66-0.86)</w:t>
+            </w:r>
+          </w:p>
+        </w:tc>
+        <w:tc>
+          <w:tcPr/>
+          <w:p>
+            <w:pPr>
+              <w:pStyle w:val="Compact"/>
+              <w:jc w:val="right"/>
+            </w:pPr>
+            <w:r>
+              <w:t xml:space="preserve">0.80</w:t>
+            </w:r>
+          </w:p>
+        </w:tc>
+        <w:tc>
+          <w:tcPr/>
+          <w:p>
+            <w:pPr>
+              <w:pStyle w:val="Compact"/>
+              <w:jc w:val="left"/>
+            </w:pPr>
+            <w:r>
+              <w:t xml:space="preserve">0.81 (0.73-0.87)</w:t>
+            </w:r>
+          </w:p>
+        </w:tc>
+        <w:tc>
+          <w:tcPr/>
+          <w:p>
+            <w:pPr>
+              <w:pStyle w:val="Compact"/>
+              <w:jc w:val="right"/>
+            </w:pPr>
+            <w:r>
+              <w:t xml:space="preserve">0.48</w:t>
+            </w:r>
+          </w:p>
+        </w:tc>
+        <w:tc>
+          <w:tcPr/>
+          <w:p>
+            <w:pPr>
+              <w:pStyle w:val="Compact"/>
+              <w:jc w:val="left"/>
+            </w:pPr>
+            <w:r>
+              <w:t xml:space="preserve">0.48 (0.29-0.62)</w:t>
             </w:r>
           </w:p>
         </w:tc>
@@ -2367,91 +2367,91 @@
               <w:jc w:val="right"/>
             </w:pPr>
             <w:r>
-              <w:t xml:space="preserve">0.91</w:t>
-            </w:r>
-          </w:p>
-        </w:tc>
-        <w:tc>
-          <w:tcPr/>
-          <w:p>
-            <w:pPr>
-              <w:pStyle w:val="Compact"/>
-              <w:jc w:val="left"/>
-            </w:pPr>
-            <w:r>
-              <w:t xml:space="preserve">0.92 (0.84-0.96)</w:t>
-            </w:r>
-          </w:p>
-        </w:tc>
-        <w:tc>
-          <w:tcPr/>
-          <w:p>
-            <w:pPr>
-              <w:pStyle w:val="Compact"/>
-              <w:jc w:val="right"/>
-            </w:pPr>
-            <w:r>
-              <w:t xml:space="preserve">0.28</w:t>
-            </w:r>
-          </w:p>
-        </w:tc>
-        <w:tc>
-          <w:tcPr/>
-          <w:p>
-            <w:pPr>
-              <w:pStyle w:val="Compact"/>
-              <w:jc w:val="left"/>
-            </w:pPr>
-            <w:r>
-              <w:t xml:space="preserve">0.28 (0.17-0.39)</w:t>
-            </w:r>
-          </w:p>
-        </w:tc>
-        <w:tc>
-          <w:tcPr/>
-          <w:p>
-            <w:pPr>
-              <w:pStyle w:val="Compact"/>
-              <w:jc w:val="right"/>
-            </w:pPr>
-            <w:r>
-              <w:t xml:space="preserve">0.68</w:t>
-            </w:r>
-          </w:p>
-        </w:tc>
-        <w:tc>
-          <w:tcPr/>
-          <w:p>
-            <w:pPr>
-              <w:pStyle w:val="Compact"/>
-              <w:jc w:val="left"/>
-            </w:pPr>
-            <w:r>
-              <w:t xml:space="preserve">0.67 (0.61-0.74)</w:t>
-            </w:r>
-          </w:p>
-        </w:tc>
-        <w:tc>
-          <w:tcPr/>
-          <w:p>
-            <w:pPr>
-              <w:pStyle w:val="Compact"/>
-              <w:jc w:val="right"/>
-            </w:pPr>
-            <w:r>
-              <w:t xml:space="preserve">0.19</w:t>
-            </w:r>
-          </w:p>
-        </w:tc>
-        <w:tc>
-          <w:tcPr/>
-          <w:p>
-            <w:pPr>
-              <w:pStyle w:val="Compact"/>
-              <w:jc w:val="left"/>
-            </w:pPr>
-            <w:r>
-              <w:t xml:space="preserve">0.21 (0.07-0.32)</w:t>
+              <w:t xml:space="preserve">0.62</w:t>
+            </w:r>
+          </w:p>
+        </w:tc>
+        <w:tc>
+          <w:tcPr/>
+          <w:p>
+            <w:pPr>
+              <w:pStyle w:val="Compact"/>
+              <w:jc w:val="left"/>
+            </w:pPr>
+            <w:r>
+              <w:t xml:space="preserve">0.63 (0.48-0.76)</w:t>
+            </w:r>
+          </w:p>
+        </w:tc>
+        <w:tc>
+          <w:tcPr/>
+          <w:p>
+            <w:pPr>
+              <w:pStyle w:val="Compact"/>
+              <w:jc w:val="right"/>
+            </w:pPr>
+            <w:r>
+              <w:t xml:space="preserve">0.83</w:t>
+            </w:r>
+          </w:p>
+        </w:tc>
+        <w:tc>
+          <w:tcPr/>
+          <w:p>
+            <w:pPr>
+              <w:pStyle w:val="Compact"/>
+              <w:jc w:val="left"/>
+            </w:pPr>
+            <w:r>
+              <w:t xml:space="preserve">0.84 (0.74-0.9)</w:t>
+            </w:r>
+          </w:p>
+        </w:tc>
+        <w:tc>
+          <w:tcPr/>
+          <w:p>
+            <w:pPr>
+              <w:pStyle w:val="Compact"/>
+              <w:jc w:val="right"/>
+            </w:pPr>
+            <w:r>
+              <w:t xml:space="preserve">0.81</w:t>
+            </w:r>
+          </w:p>
+        </w:tc>
+        <w:tc>
+          <w:tcPr/>
+          <w:p>
+            <w:pPr>
+              <w:pStyle w:val="Compact"/>
+              <w:jc w:val="left"/>
+            </w:pPr>
+            <w:r>
+              <w:t xml:space="preserve">0.79 (0.75-0.9)</w:t>
+            </w:r>
+          </w:p>
+        </w:tc>
+        <w:tc>
+          <w:tcPr/>
+          <w:p>
+            <w:pPr>
+              <w:pStyle w:val="Compact"/>
+              <w:jc w:val="right"/>
+            </w:pPr>
+            <w:r>
+              <w:t xml:space="preserve">0.46</w:t>
+            </w:r>
+          </w:p>
+        </w:tc>
+        <w:tc>
+          <w:tcPr/>
+          <w:p>
+            <w:pPr>
+              <w:pStyle w:val="Compact"/>
+              <w:jc w:val="left"/>
+            </w:pPr>
+            <w:r>
+              <w:t xml:space="preserve">0.45 (0.33-0.67)</w:t>
             </w:r>
           </w:p>
         </w:tc>
@@ -2489,91 +2489,91 @@
               <w:jc w:val="right"/>
             </w:pPr>
             <w:r>
-              <w:t xml:space="preserve">0.59</w:t>
-            </w:r>
-          </w:p>
-        </w:tc>
-        <w:tc>
-          <w:tcPr/>
-          <w:p>
-            <w:pPr>
-              <w:pStyle w:val="Compact"/>
-              <w:jc w:val="left"/>
-            </w:pPr>
-            <w:r>
-              <w:t xml:space="preserve">0.58 (0.54-0.67)</w:t>
-            </w:r>
-          </w:p>
-        </w:tc>
-        <w:tc>
-          <w:tcPr/>
-          <w:p>
-            <w:pPr>
-              <w:pStyle w:val="Compact"/>
-              <w:jc w:val="right"/>
-            </w:pPr>
-            <w:r>
-              <w:t xml:space="preserve">0.66</w:t>
-            </w:r>
-          </w:p>
-        </w:tc>
-        <w:tc>
-          <w:tcPr/>
-          <w:p>
-            <w:pPr>
-              <w:pStyle w:val="Compact"/>
-              <w:jc w:val="left"/>
-            </w:pPr>
-            <w:r>
-              <w:t xml:space="preserve">0.68 (0.5-0.75)</w:t>
-            </w:r>
-          </w:p>
-        </w:tc>
-        <w:tc>
-          <w:tcPr/>
-          <w:p>
-            <w:pPr>
-              <w:pStyle w:val="Compact"/>
-              <w:jc w:val="right"/>
-            </w:pPr>
-            <w:r>
-              <w:t xml:space="preserve">0.67</w:t>
-            </w:r>
-          </w:p>
-        </w:tc>
-        <w:tc>
-          <w:tcPr/>
-          <w:p>
-            <w:pPr>
-              <w:pStyle w:val="Compact"/>
-              <w:jc w:val="left"/>
-            </w:pPr>
-            <w:r>
-              <w:t xml:space="preserve">0.67 (0.56-0.73)</w:t>
-            </w:r>
-          </w:p>
-        </w:tc>
-        <w:tc>
-          <w:tcPr/>
-          <w:p>
-            <w:pPr>
-              <w:pStyle w:val="Compact"/>
-              <w:jc w:val="right"/>
-            </w:pPr>
-            <w:r>
-              <w:t xml:space="preserve">0.25</w:t>
-            </w:r>
-          </w:p>
-        </w:tc>
-        <w:tc>
-          <w:tcPr/>
-          <w:p>
-            <w:pPr>
-              <w:pStyle w:val="Compact"/>
-              <w:jc w:val="left"/>
-            </w:pPr>
-            <w:r>
-              <w:t xml:space="preserve">0.27 (0.13-0.35)</w:t>
+              <w:t xml:space="preserve">NA</w:t>
+            </w:r>
+          </w:p>
+        </w:tc>
+        <w:tc>
+          <w:tcPr/>
+          <w:p>
+            <w:pPr>
+              <w:pStyle w:val="Compact"/>
+              <w:jc w:val="left"/>
+            </w:pPr>
+            <w:r>
+              <w:t xml:space="preserve">NA</w:t>
+            </w:r>
+          </w:p>
+        </w:tc>
+        <w:tc>
+          <w:tcPr/>
+          <w:p>
+            <w:pPr>
+              <w:pStyle w:val="Compact"/>
+              <w:jc w:val="right"/>
+            </w:pPr>
+            <w:r>
+              <w:t xml:space="preserve">NA</w:t>
+            </w:r>
+          </w:p>
+        </w:tc>
+        <w:tc>
+          <w:tcPr/>
+          <w:p>
+            <w:pPr>
+              <w:pStyle w:val="Compact"/>
+              <w:jc w:val="left"/>
+            </w:pPr>
+            <w:r>
+              <w:t xml:space="preserve">NA</w:t>
+            </w:r>
+          </w:p>
+        </w:tc>
+        <w:tc>
+          <w:tcPr/>
+          <w:p>
+            <w:pPr>
+              <w:pStyle w:val="Compact"/>
+              <w:jc w:val="right"/>
+            </w:pPr>
+            <w:r>
+              <w:t xml:space="preserve">NA</w:t>
+            </w:r>
+          </w:p>
+        </w:tc>
+        <w:tc>
+          <w:tcPr/>
+          <w:p>
+            <w:pPr>
+              <w:pStyle w:val="Compact"/>
+              <w:jc w:val="left"/>
+            </w:pPr>
+            <w:r>
+              <w:t xml:space="preserve">NA</w:t>
+            </w:r>
+          </w:p>
+        </w:tc>
+        <w:tc>
+          <w:tcPr/>
+          <w:p>
+            <w:pPr>
+              <w:pStyle w:val="Compact"/>
+              <w:jc w:val="right"/>
+            </w:pPr>
+            <w:r>
+              <w:t xml:space="preserve">NA</w:t>
+            </w:r>
+          </w:p>
+        </w:tc>
+        <w:tc>
+          <w:tcPr/>
+          <w:p>
+            <w:pPr>
+              <w:pStyle w:val="Compact"/>
+              <w:jc w:val="left"/>
+            </w:pPr>
+            <w:r>
+              <w:t xml:space="preserve">NA</w:t>
             </w:r>
           </w:p>
         </w:tc>
@@ -2611,91 +2611,91 @@
               <w:jc w:val="right"/>
             </w:pPr>
             <w:r>
-              <w:t xml:space="preserve">0.90</w:t>
-            </w:r>
-          </w:p>
-        </w:tc>
-        <w:tc>
-          <w:tcPr/>
-          <w:p>
-            <w:pPr>
-              <w:pStyle w:val="Compact"/>
-              <w:jc w:val="left"/>
-            </w:pPr>
-            <w:r>
-              <w:t xml:space="preserve">0.89 (0.86-0.95)</w:t>
-            </w:r>
-          </w:p>
-        </w:tc>
-        <w:tc>
-          <w:tcPr/>
-          <w:p>
-            <w:pPr>
-              <w:pStyle w:val="Compact"/>
-              <w:jc w:val="right"/>
-            </w:pPr>
-            <w:r>
-              <w:t xml:space="preserve">0.23</w:t>
-            </w:r>
-          </w:p>
-        </w:tc>
-        <w:tc>
-          <w:tcPr/>
-          <w:p>
-            <w:pPr>
-              <w:pStyle w:val="Compact"/>
-              <w:jc w:val="left"/>
-            </w:pPr>
-            <w:r>
-              <w:t xml:space="preserve">0.22 (0.11-0.33)</w:t>
-            </w:r>
-          </w:p>
-        </w:tc>
-        <w:tc>
-          <w:tcPr/>
-          <w:p>
-            <w:pPr>
-              <w:pStyle w:val="Compact"/>
-              <w:jc w:val="right"/>
-            </w:pPr>
-            <w:r>
-              <w:t xml:space="preserve">0.57</w:t>
-            </w:r>
-          </w:p>
-        </w:tc>
-        <w:tc>
-          <w:tcPr/>
-          <w:p>
-            <w:pPr>
-              <w:pStyle w:val="Compact"/>
-              <w:jc w:val="left"/>
-            </w:pPr>
-            <w:r>
-              <w:t xml:space="preserve">0.57 (0.49-0.73)</w:t>
-            </w:r>
-          </w:p>
-        </w:tc>
-        <w:tc>
-          <w:tcPr/>
-          <w:p>
-            <w:pPr>
-              <w:pStyle w:val="Compact"/>
-              <w:jc w:val="right"/>
-            </w:pPr>
-            <w:r>
-              <w:t xml:space="preserve">0.13</w:t>
-            </w:r>
-          </w:p>
-        </w:tc>
-        <w:tc>
-          <w:tcPr/>
-          <w:p>
-            <w:pPr>
-              <w:pStyle w:val="Compact"/>
-              <w:jc w:val="left"/>
-            </w:pPr>
-            <w:r>
-              <w:t xml:space="preserve">0.12 (0.04-0.23)</w:t>
+              <w:t xml:space="preserve">NA</w:t>
+            </w:r>
+          </w:p>
+        </w:tc>
+        <w:tc>
+          <w:tcPr/>
+          <w:p>
+            <w:pPr>
+              <w:pStyle w:val="Compact"/>
+              <w:jc w:val="left"/>
+            </w:pPr>
+            <w:r>
+              <w:t xml:space="preserve">NA</w:t>
+            </w:r>
+          </w:p>
+        </w:tc>
+        <w:tc>
+          <w:tcPr/>
+          <w:p>
+            <w:pPr>
+              <w:pStyle w:val="Compact"/>
+              <w:jc w:val="right"/>
+            </w:pPr>
+            <w:r>
+              <w:t xml:space="preserve">NA</w:t>
+            </w:r>
+          </w:p>
+        </w:tc>
+        <w:tc>
+          <w:tcPr/>
+          <w:p>
+            <w:pPr>
+              <w:pStyle w:val="Compact"/>
+              <w:jc w:val="left"/>
+            </w:pPr>
+            <w:r>
+              <w:t xml:space="preserve">NA</w:t>
+            </w:r>
+          </w:p>
+        </w:tc>
+        <w:tc>
+          <w:tcPr/>
+          <w:p>
+            <w:pPr>
+              <w:pStyle w:val="Compact"/>
+              <w:jc w:val="right"/>
+            </w:pPr>
+            <w:r>
+              <w:t xml:space="preserve">NA</w:t>
+            </w:r>
+          </w:p>
+        </w:tc>
+        <w:tc>
+          <w:tcPr/>
+          <w:p>
+            <w:pPr>
+              <w:pStyle w:val="Compact"/>
+              <w:jc w:val="left"/>
+            </w:pPr>
+            <w:r>
+              <w:t xml:space="preserve">NA</w:t>
+            </w:r>
+          </w:p>
+        </w:tc>
+        <w:tc>
+          <w:tcPr/>
+          <w:p>
+            <w:pPr>
+              <w:pStyle w:val="Compact"/>
+              <w:jc w:val="right"/>
+            </w:pPr>
+            <w:r>
+              <w:t xml:space="preserve">NA</w:t>
+            </w:r>
+          </w:p>
+        </w:tc>
+        <w:tc>
+          <w:tcPr/>
+          <w:p>
+            <w:pPr>
+              <w:pStyle w:val="Compact"/>
+              <w:jc w:val="left"/>
+            </w:pPr>
+            <w:r>
+              <w:t xml:space="preserve">NA</w:t>
             </w:r>
           </w:p>
         </w:tc>
@@ -2855,91 +2855,91 @@
               <w:jc w:val="right"/>
             </w:pPr>
             <w:r>
-              <w:t xml:space="preserve">0.91</w:t>
-            </w:r>
-          </w:p>
-        </w:tc>
-        <w:tc>
-          <w:tcPr/>
-          <w:p>
-            <w:pPr>
-              <w:pStyle w:val="Compact"/>
-              <w:jc w:val="left"/>
-            </w:pPr>
-            <w:r>
-              <w:t xml:space="preserve">0.92 (0.83-0.95)</w:t>
-            </w:r>
-          </w:p>
-        </w:tc>
-        <w:tc>
-          <w:tcPr/>
-          <w:p>
-            <w:pPr>
-              <w:pStyle w:val="Compact"/>
-              <w:jc w:val="right"/>
-            </w:pPr>
-            <w:r>
-              <w:t xml:space="preserve">0.31</w:t>
-            </w:r>
-          </w:p>
-        </w:tc>
-        <w:tc>
-          <w:tcPr/>
-          <w:p>
-            <w:pPr>
-              <w:pStyle w:val="Compact"/>
-              <w:jc w:val="left"/>
-            </w:pPr>
-            <w:r>
-              <w:t xml:space="preserve">0.29 (0.17-0.46)</w:t>
-            </w:r>
-          </w:p>
-        </w:tc>
-        <w:tc>
-          <w:tcPr/>
-          <w:p>
-            <w:pPr>
-              <w:pStyle w:val="Compact"/>
-              <w:jc w:val="right"/>
-            </w:pPr>
-            <w:r>
-              <w:t xml:space="preserve">0.68</w:t>
-            </w:r>
-          </w:p>
-        </w:tc>
-        <w:tc>
-          <w:tcPr/>
-          <w:p>
-            <w:pPr>
-              <w:pStyle w:val="Compact"/>
-              <w:jc w:val="left"/>
-            </w:pPr>
-            <w:r>
-              <w:t xml:space="preserve">0.68 (0.59-0.78)</w:t>
-            </w:r>
-          </w:p>
-        </w:tc>
-        <w:tc>
-          <w:tcPr/>
-          <w:p>
-            <w:pPr>
-              <w:pStyle w:val="Compact"/>
-              <w:jc w:val="right"/>
-            </w:pPr>
-            <w:r>
-              <w:t xml:space="preserve">0.22</w:t>
-            </w:r>
-          </w:p>
-        </w:tc>
-        <w:tc>
-          <w:tcPr/>
-          <w:p>
-            <w:pPr>
-              <w:pStyle w:val="Compact"/>
-              <w:jc w:val="left"/>
-            </w:pPr>
-            <w:r>
-              <w:t xml:space="preserve">0.19 (0.09-0.4)</w:t>
+              <w:t xml:space="preserve">0.57</w:t>
+            </w:r>
+          </w:p>
+        </w:tc>
+        <w:tc>
+          <w:tcPr/>
+          <w:p>
+            <w:pPr>
+              <w:pStyle w:val="Compact"/>
+              <w:jc w:val="left"/>
+            </w:pPr>
+            <w:r>
+              <w:t xml:space="preserve">0.58 (0.39-0.74)</w:t>
+            </w:r>
+          </w:p>
+        </w:tc>
+        <w:tc>
+          <w:tcPr/>
+          <w:p>
+            <w:pPr>
+              <w:pStyle w:val="Compact"/>
+              <w:jc w:val="right"/>
+            </w:pPr>
+            <w:r>
+              <w:t xml:space="preserve">0.83</w:t>
+            </w:r>
+          </w:p>
+        </w:tc>
+        <w:tc>
+          <w:tcPr/>
+          <w:p>
+            <w:pPr>
+              <w:pStyle w:val="Compact"/>
+              <w:jc w:val="left"/>
+            </w:pPr>
+            <w:r>
+              <w:t xml:space="preserve">0.83 (0.76-0.9)</w:t>
+            </w:r>
+          </w:p>
+        </w:tc>
+        <w:tc>
+          <w:tcPr/>
+          <w:p>
+            <w:pPr>
+              <w:pStyle w:val="Compact"/>
+              <w:jc w:val="right"/>
+            </w:pPr>
+            <w:r>
+              <w:t xml:space="preserve">0.77</w:t>
+            </w:r>
+          </w:p>
+        </w:tc>
+        <w:tc>
+          <w:tcPr/>
+          <w:p>
+            <w:pPr>
+              <w:pStyle w:val="Compact"/>
+              <w:jc w:val="left"/>
+            </w:pPr>
+            <w:r>
+              <w:t xml:space="preserve">0.79 (0.61-0.9)</w:t>
+            </w:r>
+          </w:p>
+        </w:tc>
+        <w:tc>
+          <w:tcPr/>
+          <w:p>
+            <w:pPr>
+              <w:pStyle w:val="Compact"/>
+              <w:jc w:val="right"/>
+            </w:pPr>
+            <w:r>
+              <w:t xml:space="preserve">0.40</w:t>
+            </w:r>
+          </w:p>
+        </w:tc>
+        <w:tc>
+          <w:tcPr/>
+          <w:p>
+            <w:pPr>
+              <w:pStyle w:val="Compact"/>
+              <w:jc w:val="left"/>
+            </w:pPr>
+            <w:r>
+              <w:t xml:space="preserve">0.41 (0.2-0.64)</w:t>
             </w:r>
           </w:p>
         </w:tc>
@@ -2977,91 +2977,91 @@
               <w:jc w:val="right"/>
             </w:pPr>
             <w:r>
-              <w:t xml:space="preserve">0.62</w:t>
-            </w:r>
-          </w:p>
-        </w:tc>
-        <w:tc>
-          <w:tcPr/>
-          <w:p>
-            <w:pPr>
-              <w:pStyle w:val="Compact"/>
-              <w:jc w:val="left"/>
-            </w:pPr>
-            <w:r>
-              <w:t xml:space="preserve">0.63 (0.54-0.66)</w:t>
-            </w:r>
-          </w:p>
-        </w:tc>
-        <w:tc>
-          <w:tcPr/>
-          <w:p>
-            <w:pPr>
-              <w:pStyle w:val="Compact"/>
-              <w:jc w:val="right"/>
-            </w:pPr>
-            <w:r>
-              <w:t xml:space="preserve">0.63</w:t>
-            </w:r>
-          </w:p>
-        </w:tc>
-        <w:tc>
-          <w:tcPr/>
-          <w:p>
-            <w:pPr>
-              <w:pStyle w:val="Compact"/>
-              <w:jc w:val="left"/>
-            </w:pPr>
-            <w:r>
-              <w:t xml:space="preserve">0.64 (0.46-0.75)</w:t>
-            </w:r>
-          </w:p>
-        </w:tc>
-        <w:tc>
-          <w:tcPr/>
-          <w:p>
-            <w:pPr>
-              <w:pStyle w:val="Compact"/>
-              <w:jc w:val="right"/>
-            </w:pPr>
-            <w:r>
-              <w:t xml:space="preserve">0.66</w:t>
-            </w:r>
-          </w:p>
-        </w:tc>
-        <w:tc>
-          <w:tcPr/>
-          <w:p>
-            <w:pPr>
-              <w:pStyle w:val="Compact"/>
-              <w:jc w:val="left"/>
-            </w:pPr>
-            <w:r>
-              <w:t xml:space="preserve">0.67 (0.56-0.74)</w:t>
-            </w:r>
-          </w:p>
-        </w:tc>
-        <w:tc>
-          <w:tcPr/>
-          <w:p>
-            <w:pPr>
-              <w:pStyle w:val="Compact"/>
-              <w:jc w:val="right"/>
-            </w:pPr>
-            <w:r>
-              <w:t xml:space="preserve">0.24</w:t>
-            </w:r>
-          </w:p>
-        </w:tc>
-        <w:tc>
-          <w:tcPr/>
-          <w:p>
-            <w:pPr>
-              <w:pStyle w:val="Compact"/>
-              <w:jc w:val="left"/>
-            </w:pPr>
-            <w:r>
-              <w:t xml:space="preserve">0.24 (0.12-0.41)</w:t>
+              <w:t xml:space="preserve">NA</w:t>
+            </w:r>
+          </w:p>
+        </w:tc>
+        <w:tc>
+          <w:tcPr/>
+          <w:p>
+            <w:pPr>
+              <w:pStyle w:val="Compact"/>
+              <w:jc w:val="left"/>
+            </w:pPr>
+            <w:r>
+              <w:t xml:space="preserve">NA</w:t>
+            </w:r>
+          </w:p>
+        </w:tc>
+        <w:tc>
+          <w:tcPr/>
+          <w:p>
+            <w:pPr>
+              <w:pStyle w:val="Compact"/>
+              <w:jc w:val="right"/>
+            </w:pPr>
+            <w:r>
+              <w:t xml:space="preserve">NA</w:t>
+            </w:r>
+          </w:p>
+        </w:tc>
+        <w:tc>
+          <w:tcPr/>
+          <w:p>
+            <w:pPr>
+              <w:pStyle w:val="Compact"/>
+              <w:jc w:val="left"/>
+            </w:pPr>
+            <w:r>
+              <w:t xml:space="preserve">NA</w:t>
+            </w:r>
+          </w:p>
+        </w:tc>
+        <w:tc>
+          <w:tcPr/>
+          <w:p>
+            <w:pPr>
+              <w:pStyle w:val="Compact"/>
+              <w:jc w:val="right"/>
+            </w:pPr>
+            <w:r>
+              <w:t xml:space="preserve">NA</w:t>
+            </w:r>
+          </w:p>
+        </w:tc>
+        <w:tc>
+          <w:tcPr/>
+          <w:p>
+            <w:pPr>
+              <w:pStyle w:val="Compact"/>
+              <w:jc w:val="left"/>
+            </w:pPr>
+            <w:r>
+              <w:t xml:space="preserve">NA</w:t>
+            </w:r>
+          </w:p>
+        </w:tc>
+        <w:tc>
+          <w:tcPr/>
+          <w:p>
+            <w:pPr>
+              <w:pStyle w:val="Compact"/>
+              <w:jc w:val="right"/>
+            </w:pPr>
+            <w:r>
+              <w:t xml:space="preserve">NA</w:t>
+            </w:r>
+          </w:p>
+        </w:tc>
+        <w:tc>
+          <w:tcPr/>
+          <w:p>
+            <w:pPr>
+              <w:pStyle w:val="Compact"/>
+              <w:jc w:val="left"/>
+            </w:pPr>
+            <w:r>
+              <w:t xml:space="preserve">NA</w:t>
             </w:r>
           </w:p>
         </w:tc>
@@ -3343,91 +3343,91 @@
               <w:jc w:val="right"/>
             </w:pPr>
             <w:r>
-              <w:t xml:space="preserve">0.92</w:t>
-            </w:r>
-          </w:p>
-        </w:tc>
-        <w:tc>
-          <w:tcPr/>
-          <w:p>
-            <w:pPr>
-              <w:pStyle w:val="Compact"/>
-              <w:jc w:val="left"/>
-            </w:pPr>
-            <w:r>
-              <w:t xml:space="preserve">0.92 (0.89-0.96)</w:t>
-            </w:r>
-          </w:p>
-        </w:tc>
-        <w:tc>
-          <w:tcPr/>
-          <w:p>
-            <w:pPr>
-              <w:pStyle w:val="Compact"/>
-              <w:jc w:val="right"/>
-            </w:pPr>
-            <w:r>
-              <w:t xml:space="preserve">0.28</w:t>
-            </w:r>
-          </w:p>
-        </w:tc>
-        <w:tc>
-          <w:tcPr/>
-          <w:p>
-            <w:pPr>
-              <w:pStyle w:val="Compact"/>
-              <w:jc w:val="left"/>
-            </w:pPr>
-            <w:r>
-              <w:t xml:space="preserve">0.27 (0.12-0.44)</w:t>
-            </w:r>
-          </w:p>
-        </w:tc>
-        <w:tc>
-          <w:tcPr/>
-          <w:p>
-            <w:pPr>
-              <w:pStyle w:val="Compact"/>
-              <w:jc w:val="right"/>
-            </w:pPr>
-            <w:r>
-              <w:t xml:space="preserve">0.68</w:t>
-            </w:r>
-          </w:p>
-        </w:tc>
-        <w:tc>
-          <w:tcPr/>
-          <w:p>
-            <w:pPr>
-              <w:pStyle w:val="Compact"/>
-              <w:jc w:val="left"/>
-            </w:pPr>
-            <w:r>
-              <w:t xml:space="preserve">0.68 (0.61-0.77)</w:t>
-            </w:r>
-          </w:p>
-        </w:tc>
-        <w:tc>
-          <w:tcPr/>
-          <w:p>
-            <w:pPr>
-              <w:pStyle w:val="Compact"/>
-              <w:jc w:val="right"/>
-            </w:pPr>
-            <w:r>
-              <w:t xml:space="preserve">0.20</w:t>
-            </w:r>
-          </w:p>
-        </w:tc>
-        <w:tc>
-          <w:tcPr/>
-          <w:p>
-            <w:pPr>
-              <w:pStyle w:val="Compact"/>
-              <w:jc w:val="left"/>
-            </w:pPr>
-            <w:r>
-              <w:t xml:space="preserve">0.19 (0.05-0.39)</w:t>
+              <w:t xml:space="preserve">0.62</w:t>
+            </w:r>
+          </w:p>
+        </w:tc>
+        <w:tc>
+          <w:tcPr/>
+          <w:p>
+            <w:pPr>
+              <w:pStyle w:val="Compact"/>
+              <w:jc w:val="left"/>
+            </w:pPr>
+            <w:r>
+              <w:t xml:space="preserve">0.61 (0.5-0.74)</w:t>
+            </w:r>
+          </w:p>
+        </w:tc>
+        <w:tc>
+          <w:tcPr/>
+          <w:p>
+            <w:pPr>
+              <w:pStyle w:val="Compact"/>
+              <w:jc w:val="right"/>
+            </w:pPr>
+            <w:r>
+              <w:t xml:space="preserve">0.82</w:t>
+            </w:r>
+          </w:p>
+        </w:tc>
+        <w:tc>
+          <w:tcPr/>
+          <w:p>
+            <w:pPr>
+              <w:pStyle w:val="Compact"/>
+              <w:jc w:val="left"/>
+            </w:pPr>
+            <w:r>
+              <w:t xml:space="preserve">0.84 (0.72-0.88)</w:t>
+            </w:r>
+          </w:p>
+        </w:tc>
+        <w:tc>
+          <w:tcPr/>
+          <w:p>
+            <w:pPr>
+              <w:pStyle w:val="Compact"/>
+              <w:jc w:val="right"/>
+            </w:pPr>
+            <w:r>
+              <w:t xml:space="preserve">0.80</w:t>
+            </w:r>
+          </w:p>
+        </w:tc>
+        <w:tc>
+          <w:tcPr/>
+          <w:p>
+            <w:pPr>
+              <w:pStyle w:val="Compact"/>
+              <w:jc w:val="left"/>
+            </w:pPr>
+            <w:r>
+              <w:t xml:space="preserve">0.79 (0.75-0.9)</w:t>
+            </w:r>
+          </w:p>
+        </w:tc>
+        <w:tc>
+          <w:tcPr/>
+          <w:p>
+            <w:pPr>
+              <w:pStyle w:val="Compact"/>
+              <w:jc w:val="right"/>
+            </w:pPr>
+            <w:r>
+              <w:t xml:space="preserve">0.44</w:t>
+            </w:r>
+          </w:p>
+        </w:tc>
+        <w:tc>
+          <w:tcPr/>
+          <w:p>
+            <w:pPr>
+              <w:pStyle w:val="Compact"/>
+              <w:jc w:val="left"/>
+            </w:pPr>
+            <w:r>
+              <w:t xml:space="preserve">0.42 (0.34-0.59)</w:t>
             </w:r>
           </w:p>
         </w:tc>
@@ -3465,91 +3465,91 @@
               <w:jc w:val="right"/>
             </w:pPr>
             <w:r>
-              <w:t xml:space="preserve">0.59</w:t>
-            </w:r>
-          </w:p>
-        </w:tc>
-        <w:tc>
-          <w:tcPr/>
-          <w:p>
-            <w:pPr>
-              <w:pStyle w:val="Compact"/>
-              <w:jc w:val="left"/>
-            </w:pPr>
-            <w:r>
-              <w:t xml:space="preserve">0.6 (0.52-0.65)</w:t>
-            </w:r>
-          </w:p>
-        </w:tc>
-        <w:tc>
-          <w:tcPr/>
-          <w:p>
-            <w:pPr>
-              <w:pStyle w:val="Compact"/>
-              <w:jc w:val="right"/>
-            </w:pPr>
-            <w:r>
-              <w:t xml:space="preserve">0.67</w:t>
-            </w:r>
-          </w:p>
-        </w:tc>
-        <w:tc>
-          <w:tcPr/>
-          <w:p>
-            <w:pPr>
-              <w:pStyle w:val="Compact"/>
-              <w:jc w:val="left"/>
-            </w:pPr>
-            <w:r>
-              <w:t xml:space="preserve">0.7 (0.5-0.72)</w:t>
-            </w:r>
-          </w:p>
-        </w:tc>
-        <w:tc>
-          <w:tcPr/>
-          <w:p>
-            <w:pPr>
-              <w:pStyle w:val="Compact"/>
-              <w:jc w:val="right"/>
-            </w:pPr>
-            <w:r>
-              <w:t xml:space="preserve">0.66</w:t>
-            </w:r>
-          </w:p>
-        </w:tc>
-        <w:tc>
-          <w:tcPr/>
-          <w:p>
-            <w:pPr>
-              <w:pStyle w:val="Compact"/>
-              <w:jc w:val="left"/>
-            </w:pPr>
-            <w:r>
-              <w:t xml:space="preserve">0.67 (0.56-0.74)</w:t>
-            </w:r>
-          </w:p>
-        </w:tc>
-        <w:tc>
-          <w:tcPr/>
-          <w:p>
-            <w:pPr>
-              <w:pStyle w:val="Compact"/>
-              <w:jc w:val="right"/>
-            </w:pPr>
-            <w:r>
-              <w:t xml:space="preserve">0.26</w:t>
-            </w:r>
-          </w:p>
-        </w:tc>
-        <w:tc>
-          <w:tcPr/>
-          <w:p>
-            <w:pPr>
-              <w:pStyle w:val="Compact"/>
-              <w:jc w:val="left"/>
-            </w:pPr>
-            <w:r>
-              <w:t xml:space="preserve">0.27 (0.15-0.36)</w:t>
+              <w:t xml:space="preserve">0.34</w:t>
+            </w:r>
+          </w:p>
+        </w:tc>
+        <w:tc>
+          <w:tcPr/>
+          <w:p>
+            <w:pPr>
+              <w:pStyle w:val="Compact"/>
+              <w:jc w:val="left"/>
+            </w:pPr>
+            <w:r>
+              <w:t xml:space="preserve">0.36 (0.24-0.44)</w:t>
+            </w:r>
+          </w:p>
+        </w:tc>
+        <w:tc>
+          <w:tcPr/>
+          <w:p>
+            <w:pPr>
+              <w:pStyle w:val="Compact"/>
+              <w:jc w:val="right"/>
+            </w:pPr>
+            <w:r>
+              <w:t xml:space="preserve">0.94</w:t>
+            </w:r>
+          </w:p>
+        </w:tc>
+        <w:tc>
+          <w:tcPr/>
+          <w:p>
+            <w:pPr>
+              <w:pStyle w:val="Compact"/>
+              <w:jc w:val="left"/>
+            </w:pPr>
+            <w:r>
+              <w:t xml:space="preserve">0.94 (0.86-0.99)</w:t>
+            </w:r>
+          </w:p>
+        </w:tc>
+        <w:tc>
+          <w:tcPr/>
+          <w:p>
+            <w:pPr>
+              <w:pStyle w:val="Compact"/>
+              <w:jc w:val="right"/>
+            </w:pPr>
+            <w:r>
+              <w:t xml:space="preserve">0.77</w:t>
+            </w:r>
+          </w:p>
+        </w:tc>
+        <w:tc>
+          <w:tcPr/>
+          <w:p>
+            <w:pPr>
+              <w:pStyle w:val="Compact"/>
+              <w:jc w:val="left"/>
+            </w:pPr>
+            <w:r>
+              <w:t xml:space="preserve">0.79 (0.56-0.86)</w:t>
+            </w:r>
+          </w:p>
+        </w:tc>
+        <w:tc>
+          <w:tcPr/>
+          <w:p>
+            <w:pPr>
+              <w:pStyle w:val="Compact"/>
+              <w:jc w:val="right"/>
+            </w:pPr>
+            <w:r>
+              <w:t xml:space="preserve">0.28</w:t>
+            </w:r>
+          </w:p>
+        </w:tc>
+        <w:tc>
+          <w:tcPr/>
+          <w:p>
+            <w:pPr>
+              <w:pStyle w:val="Compact"/>
+              <w:jc w:val="left"/>
+            </w:pPr>
+            <w:r>
+              <w:t xml:space="preserve">0.31 (0.16-0.41)</w:t>
             </w:r>
           </w:p>
         </w:tc>
@@ -3831,91 +3831,91 @@
               <w:jc w:val="right"/>
             </w:pPr>
             <w:r>
-              <w:t xml:space="preserve">0.90</w:t>
-            </w:r>
-          </w:p>
-        </w:tc>
-        <w:tc>
-          <w:tcPr/>
-          <w:p>
-            <w:pPr>
-              <w:pStyle w:val="Compact"/>
-              <w:jc w:val="left"/>
-            </w:pPr>
-            <w:r>
-              <w:t xml:space="preserve">0.91 (0.83-0.96)</w:t>
-            </w:r>
-          </w:p>
-        </w:tc>
-        <w:tc>
-          <w:tcPr/>
-          <w:p>
-            <w:pPr>
-              <w:pStyle w:val="Compact"/>
-              <w:jc w:val="right"/>
-            </w:pPr>
-            <w:r>
-              <w:t xml:space="preserve">0.32</w:t>
-            </w:r>
-          </w:p>
-        </w:tc>
-        <w:tc>
-          <w:tcPr/>
-          <w:p>
-            <w:pPr>
-              <w:pStyle w:val="Compact"/>
-              <w:jc w:val="left"/>
-            </w:pPr>
-            <w:r>
-              <w:t xml:space="preserve">0.29 (0.21-0.5)</w:t>
-            </w:r>
-          </w:p>
-        </w:tc>
-        <w:tc>
-          <w:tcPr/>
-          <w:p>
-            <w:pPr>
-              <w:pStyle w:val="Compact"/>
-              <w:jc w:val="right"/>
-            </w:pPr>
-            <w:r>
-              <w:t xml:space="preserve">0.68</w:t>
-            </w:r>
-          </w:p>
-        </w:tc>
-        <w:tc>
-          <w:tcPr/>
-          <w:p>
-            <w:pPr>
-              <w:pStyle w:val="Compact"/>
-              <w:jc w:val="left"/>
-            </w:pPr>
-            <w:r>
-              <w:t xml:space="preserve">0.68 (0.59-0.79)</w:t>
-            </w:r>
-          </w:p>
-        </w:tc>
-        <w:tc>
-          <w:tcPr/>
-          <w:p>
-            <w:pPr>
-              <w:pStyle w:val="Compact"/>
-              <w:jc w:val="right"/>
-            </w:pPr>
-            <w:r>
-              <w:t xml:space="preserve">0.22</w:t>
-            </w:r>
-          </w:p>
-        </w:tc>
-        <w:tc>
-          <w:tcPr/>
-          <w:p>
-            <w:pPr>
-              <w:pStyle w:val="Compact"/>
-              <w:jc w:val="left"/>
-            </w:pPr>
-            <w:r>
-              <w:t xml:space="preserve">0.18 (0.09-0.45)</w:t>
+              <w:t xml:space="preserve">0.63</w:t>
+            </w:r>
+          </w:p>
+        </w:tc>
+        <w:tc>
+          <w:tcPr/>
+          <w:p>
+            <w:pPr>
+              <w:pStyle w:val="Compact"/>
+              <w:jc w:val="left"/>
+            </w:pPr>
+            <w:r>
+              <w:t xml:space="preserve">0.62 (0.56-0.75)</w:t>
+            </w:r>
+          </w:p>
+        </w:tc>
+        <w:tc>
+          <w:tcPr/>
+          <w:p>
+            <w:pPr>
+              <w:pStyle w:val="Compact"/>
+              <w:jc w:val="right"/>
+            </w:pPr>
+            <w:r>
+              <w:t xml:space="preserve">0.82</w:t>
+            </w:r>
+          </w:p>
+        </w:tc>
+        <w:tc>
+          <w:tcPr/>
+          <w:p>
+            <w:pPr>
+              <w:pStyle w:val="Compact"/>
+              <w:jc w:val="left"/>
+            </w:pPr>
+            <w:r>
+              <w:t xml:space="preserve">0.85 (0.69-0.92)</w:t>
+            </w:r>
+          </w:p>
+        </w:tc>
+        <w:tc>
+          <w:tcPr/>
+          <w:p>
+            <w:pPr>
+              <w:pStyle w:val="Compact"/>
+              <w:jc w:val="right"/>
+            </w:pPr>
+            <w:r>
+              <w:t xml:space="preserve">0.81</w:t>
+            </w:r>
+          </w:p>
+        </w:tc>
+        <w:tc>
+          <w:tcPr/>
+          <w:p>
+            <w:pPr>
+              <w:pStyle w:val="Compact"/>
+              <w:jc w:val="left"/>
+            </w:pPr>
+            <w:r>
+              <w:t xml:space="preserve">0.79 (0.74-0.91)</w:t>
+            </w:r>
+          </w:p>
+        </w:tc>
+        <w:tc>
+          <w:tcPr/>
+          <w:p>
+            <w:pPr>
+              <w:pStyle w:val="Compact"/>
+              <w:jc w:val="right"/>
+            </w:pPr>
+            <w:r>
+              <w:t xml:space="preserve">0.46</w:t>
+            </w:r>
+          </w:p>
+        </w:tc>
+        <w:tc>
+          <w:tcPr/>
+          <w:p>
+            <w:pPr>
+              <w:pStyle w:val="Compact"/>
+              <w:jc w:val="left"/>
+            </w:pPr>
+            <w:r>
+              <w:t xml:space="preserve">0.43 (0.34-0.62)</w:t>
             </w:r>
           </w:p>
         </w:tc>
@@ -3953,91 +3953,91 @@
               <w:jc w:val="right"/>
             </w:pPr>
             <w:r>
-              <w:t xml:space="preserve">0.60</w:t>
-            </w:r>
-          </w:p>
-        </w:tc>
-        <w:tc>
-          <w:tcPr/>
-          <w:p>
-            <w:pPr>
-              <w:pStyle w:val="Compact"/>
-              <w:jc w:val="left"/>
-            </w:pPr>
-            <w:r>
-              <w:t xml:space="preserve">0.6 (0.49-0.67)</w:t>
-            </w:r>
-          </w:p>
-        </w:tc>
-        <w:tc>
-          <w:tcPr/>
-          <w:p>
-            <w:pPr>
-              <w:pStyle w:val="Compact"/>
-              <w:jc w:val="right"/>
-            </w:pPr>
-            <w:r>
-              <w:t xml:space="preserve">0.64</w:t>
-            </w:r>
-          </w:p>
-        </w:tc>
-        <w:tc>
-          <w:tcPr/>
-          <w:p>
-            <w:pPr>
-              <w:pStyle w:val="Compact"/>
-              <w:jc w:val="left"/>
-            </w:pPr>
-            <w:r>
-              <w:t xml:space="preserve">0.65 (0.46-0.75)</w:t>
-            </w:r>
-          </w:p>
-        </w:tc>
-        <w:tc>
-          <w:tcPr/>
-          <w:p>
-            <w:pPr>
-              <w:pStyle w:val="Compact"/>
-              <w:jc w:val="right"/>
-            </w:pPr>
-            <w:r>
-              <w:t xml:space="preserve">0.67</w:t>
-            </w:r>
-          </w:p>
-        </w:tc>
-        <w:tc>
-          <w:tcPr/>
-          <w:p>
-            <w:pPr>
-              <w:pStyle w:val="Compact"/>
-              <w:jc w:val="left"/>
-            </w:pPr>
-            <w:r>
-              <w:t xml:space="preserve">0.67 (0.58-0.75)</w:t>
-            </w:r>
-          </w:p>
-        </w:tc>
-        <w:tc>
-          <w:tcPr/>
-          <w:p>
-            <w:pPr>
-              <w:pStyle w:val="Compact"/>
-              <w:jc w:val="right"/>
-            </w:pPr>
-            <w:r>
-              <w:t xml:space="preserve">0.23</w:t>
-            </w:r>
-          </w:p>
-        </w:tc>
-        <w:tc>
-          <w:tcPr/>
-          <w:p>
-            <w:pPr>
-              <w:pStyle w:val="Compact"/>
-              <w:jc w:val="left"/>
-            </w:pPr>
-            <w:r>
-              <w:t xml:space="preserve">0.22 (0.07-0.38)</w:t>
+              <w:t xml:space="preserve">NA</w:t>
+            </w:r>
+          </w:p>
+        </w:tc>
+        <w:tc>
+          <w:tcPr/>
+          <w:p>
+            <w:pPr>
+              <w:pStyle w:val="Compact"/>
+              <w:jc w:val="left"/>
+            </w:pPr>
+            <w:r>
+              <w:t xml:space="preserve">NA</w:t>
+            </w:r>
+          </w:p>
+        </w:tc>
+        <w:tc>
+          <w:tcPr/>
+          <w:p>
+            <w:pPr>
+              <w:pStyle w:val="Compact"/>
+              <w:jc w:val="right"/>
+            </w:pPr>
+            <w:r>
+              <w:t xml:space="preserve">NA</w:t>
+            </w:r>
+          </w:p>
+        </w:tc>
+        <w:tc>
+          <w:tcPr/>
+          <w:p>
+            <w:pPr>
+              <w:pStyle w:val="Compact"/>
+              <w:jc w:val="left"/>
+            </w:pPr>
+            <w:r>
+              <w:t xml:space="preserve">NA</w:t>
+            </w:r>
+          </w:p>
+        </w:tc>
+        <w:tc>
+          <w:tcPr/>
+          <w:p>
+            <w:pPr>
+              <w:pStyle w:val="Compact"/>
+              <w:jc w:val="right"/>
+            </w:pPr>
+            <w:r>
+              <w:t xml:space="preserve">NA</w:t>
+            </w:r>
+          </w:p>
+        </w:tc>
+        <w:tc>
+          <w:tcPr/>
+          <w:p>
+            <w:pPr>
+              <w:pStyle w:val="Compact"/>
+              <w:jc w:val="left"/>
+            </w:pPr>
+            <w:r>
+              <w:t xml:space="preserve">NA</w:t>
+            </w:r>
+          </w:p>
+        </w:tc>
+        <w:tc>
+          <w:tcPr/>
+          <w:p>
+            <w:pPr>
+              <w:pStyle w:val="Compact"/>
+              <w:jc w:val="right"/>
+            </w:pPr>
+            <w:r>
+              <w:t xml:space="preserve">NA</w:t>
+            </w:r>
+          </w:p>
+        </w:tc>
+        <w:tc>
+          <w:tcPr/>
+          <w:p>
+            <w:pPr>
+              <w:pStyle w:val="Compact"/>
+              <w:jc w:val="left"/>
+            </w:pPr>
+            <w:r>
+              <w:t xml:space="preserve">NA</w:t>
             </w:r>
           </w:p>
         </w:tc>

</xml_diff>